<commit_message>
Day6-FileManager: fix sandbox path-traversal escape, guard disk I/O, add project.md
FileSystemPlugin claimed to sandbox the AI to the current directory,
but ReadFileAsync/WriteFileAsync only did Path.Combine with no
validation, so a file name like "../secrets.txt" (or an absolute path)
could escape the sandbox. Adds TryResolveSandboxedPath to resolve and
verify the full path stays under the sandbox root, and wraps both
disk calls in try/catch so a locked/permission-denied file returns a
tool error instead of crashing the session. Also drops an unused
using. Syncs the docx's Complete Code listing and one Code Walkthrough
sentence, and replaces missing.md with project.md.
</commit_message>
<xml_diff>
--- a/Day6-FileManager.docx
+++ b/Day6-FileManager.docx
@@ -149,14 +149,11 @@
         <w:rPr>
           <w:b/>
         </w:rPr>
+        <w:lastRenderedPageBreak/>
         <w:t>AddFromObject vs. AddFromType</w:t>
       </w:r>
       <w:r>
-        <w:t>: `builder.Plugi</w:t>
-      </w:r>
-      <w:r>
-        <w:lastRenderedPageBreak/>
-        <w:t>ns.AddFromObject(new FileSystemPlugin(), "FileSystem")` registers an *already-constructed instance* of a plugin, in contrast to Day 4's `AddFromType&lt;MathPlugin&gt;()`, which let Semantic Kernel construct the instance itself. This matters here because `FileSystemPlugin` has constructor logic (capturing the sandboxed directory) that needs to run before registration.</w:t>
+        <w:t>: `builder.Plugins.AddFromObject(new FileSystemPlugin(), "FileSystem")` registers an *already-constructed instance* of a plugin, in contrast to Day 4's `AddFromType&lt;MathPlugin&gt;()`, which let Semantic Kernel construct the instance itself. This matters here because `FileSystemPlugin` has constructor logic (capturing the sandboxed directory) that needs to run before registration.</w:t>
       </w:r>
     </w:p>
     <w:p>
@@ -194,11 +191,7 @@
         <w:t>AI Sandboxing (Security)</w:t>
       </w:r>
       <w:r>
-        <w:t>: `FileSystemPlugin`'s constructor hardcodes all file operations to `Directory.GetCurrentDirectory()`, restricting the AI to a bounded area of the filesyst</w:t>
-      </w:r>
-      <w:r>
-        <w:lastRenderedPageBreak/>
-        <w:t>em instead of giving it unrestricted disk access.</w:t>
+        <w:t>: `FileSystemPlugin`'s constructor hardcodes all file operations to `Directory.GetCurrentDirectory()`, restricting the AI to a bounded area of the filesystem instead of giving it unrestricted disk access.</w:t>
       </w:r>
     </w:p>
     <w:p>
@@ -450,22 +443,6 @@
           <w:rFonts w:ascii="Consolas" w:hAnsi="Consolas"/>
           <w:sz w:val="19"/>
         </w:rPr>
-        <w:t>using System.Security.Cryptography.X509Certificates;</w:t>
-      </w:r>
-    </w:p>
-    <w:p>
-      <w:pPr>
-        <w:pStyle w:val="NoSpacing"/>
-        <w:rPr>
-          <w:rFonts w:ascii="Consolas" w:hAnsi="Consolas"/>
-          <w:sz w:val="19"/>
-        </w:rPr>
-      </w:pPr>
-      <w:r>
-        <w:rPr>
-          <w:rFonts w:ascii="Consolas" w:hAnsi="Consolas"/>
-          <w:sz w:val="19"/>
-        </w:rPr>
         <w:t>using System.Threading.Tasks;</w:t>
       </w:r>
     </w:p>
@@ -555,46 +532,39 @@
           <w:rFonts w:ascii="Consolas" w:hAnsi="Consolas"/>
           <w:sz w:val="19"/>
         </w:rPr>
-        <w:t xml:space="preserve">    // Step 1: Define </w:t>
-      </w:r>
+        <w:t xml:space="preserve">    // Step 1: Define the File System Plugin</w:t>
+      </w:r>
+    </w:p>
+    <w:p>
+      <w:pPr>
+        <w:pStyle w:val="NoSpacing"/>
+        <w:rPr>
+          <w:rFonts w:ascii="Consolas" w:hAnsi="Consolas"/>
+          <w:sz w:val="19"/>
+        </w:rPr>
+      </w:pPr>
+      <w:r>
+        <w:rPr>
+          <w:rFonts w:ascii="Consolas" w:hAnsi="Consolas"/>
+          <w:sz w:val="19"/>
+        </w:rPr>
+        <w:t xml:space="preserve">    public class FileSystemPlugin</w:t>
+      </w:r>
+    </w:p>
+    <w:p>
+      <w:pPr>
+        <w:pStyle w:val="NoSpacing"/>
+        <w:rPr>
+          <w:rFonts w:ascii="Consolas" w:hAnsi="Consolas"/>
+          <w:sz w:val="19"/>
+        </w:rPr>
+      </w:pPr>
       <w:r>
         <w:rPr>
           <w:rFonts w:ascii="Consolas" w:hAnsi="Consolas"/>
           <w:sz w:val="19"/>
         </w:rPr>
         <w:lastRenderedPageBreak/>
-        <w:t>the File System Plugin</w:t>
-      </w:r>
-    </w:p>
-    <w:p>
-      <w:pPr>
-        <w:pStyle w:val="NoSpacing"/>
-        <w:rPr>
-          <w:rFonts w:ascii="Consolas" w:hAnsi="Consolas"/>
-          <w:sz w:val="19"/>
-        </w:rPr>
-      </w:pPr>
-      <w:r>
-        <w:rPr>
-          <w:rFonts w:ascii="Consolas" w:hAnsi="Consolas"/>
-          <w:sz w:val="19"/>
-        </w:rPr>
-        <w:t xml:space="preserve">    public class FileSystemPlugin</w:t>
-      </w:r>
-    </w:p>
-    <w:p>
-      <w:pPr>
-        <w:pStyle w:val="NoSpacing"/>
-        <w:rPr>
-          <w:rFonts w:ascii="Consolas" w:hAnsi="Consolas"/>
-          <w:sz w:val="19"/>
-        </w:rPr>
-      </w:pPr>
-      <w:r>
-        <w:rPr>
-          <w:rFonts w:ascii="Consolas" w:hAnsi="Consolas"/>
-          <w:sz w:val="19"/>
-        </w:rPr>
         <w:t xml:space="preserve">    {</w:t>
       </w:r>
     </w:p>
@@ -773,6 +743,337 @@
           <w:rFonts w:ascii="Consolas" w:hAnsi="Consolas"/>
           <w:sz w:val="19"/>
         </w:rPr>
+        <w:t xml:space="preserve">        // Step 1b: Resolve a requested file name to a real path that is</w:t>
+      </w:r>
+    </w:p>
+    <w:p>
+      <w:pPr>
+        <w:pStyle w:val="NoSpacing"/>
+        <w:rPr>
+          <w:rFonts w:ascii="Consolas" w:hAnsi="Consolas"/>
+          <w:sz w:val="19"/>
+        </w:rPr>
+      </w:pPr>
+      <w:r>
+        <w:rPr>
+          <w:rFonts w:ascii="Consolas" w:hAnsi="Consolas"/>
+          <w:sz w:val="19"/>
+        </w:rPr>
+        <w:t xml:space="preserve">        // guaranteed to stay inside the sandbox. Path.Combine alone does not</w:t>
+      </w:r>
+    </w:p>
+    <w:p>
+      <w:pPr>
+        <w:pStyle w:val="NoSpacing"/>
+        <w:rPr>
+          <w:rFonts w:ascii="Consolas" w:hAnsi="Consolas"/>
+          <w:sz w:val="19"/>
+        </w:rPr>
+      </w:pPr>
+      <w:r>
+        <w:rPr>
+          <w:rFonts w:ascii="Consolas" w:hAnsi="Consolas"/>
+          <w:sz w:val="19"/>
+        </w:rPr>
+        <w:t xml:space="preserve">        // stop something like "../secrets.txt" or an absolute path from</w:t>
+      </w:r>
+    </w:p>
+    <w:p>
+      <w:pPr>
+        <w:pStyle w:val="NoSpacing"/>
+        <w:rPr>
+          <w:rFonts w:ascii="Consolas" w:hAnsi="Consolas"/>
+          <w:sz w:val="19"/>
+        </w:rPr>
+      </w:pPr>
+      <w:r>
+        <w:rPr>
+          <w:rFonts w:ascii="Consolas" w:hAnsi="Consolas"/>
+          <w:sz w:val="19"/>
+        </w:rPr>
+        <w:t xml:space="preserve">        // escaping _currentDirectory - we have to resolve the full path and</w:t>
+      </w:r>
+    </w:p>
+    <w:p>
+      <w:pPr>
+        <w:pStyle w:val="NoSpacing"/>
+        <w:rPr>
+          <w:rFonts w:ascii="Consolas" w:hAnsi="Consolas"/>
+          <w:sz w:val="19"/>
+        </w:rPr>
+      </w:pPr>
+      <w:r>
+        <w:rPr>
+          <w:rFonts w:ascii="Consolas" w:hAnsi="Consolas"/>
+          <w:sz w:val="19"/>
+        </w:rPr>
+        <w:t xml:space="preserve">        // verify it still lives under the sandbox root before touching disk.</w:t>
+      </w:r>
+    </w:p>
+    <w:p>
+      <w:pPr>
+        <w:pStyle w:val="NoSpacing"/>
+        <w:rPr>
+          <w:rFonts w:ascii="Consolas" w:hAnsi="Consolas"/>
+          <w:sz w:val="19"/>
+        </w:rPr>
+      </w:pPr>
+      <w:r>
+        <w:rPr>
+          <w:rFonts w:ascii="Consolas" w:hAnsi="Consolas"/>
+          <w:sz w:val="19"/>
+        </w:rPr>
+        <w:t xml:space="preserve">        private bool TryResolveSandboxedPath(string fileName, out string resolvedPath, out string error)</w:t>
+      </w:r>
+    </w:p>
+    <w:p>
+      <w:pPr>
+        <w:pStyle w:val="NoSpacing"/>
+        <w:rPr>
+          <w:rFonts w:ascii="Consolas" w:hAnsi="Consolas"/>
+          <w:sz w:val="19"/>
+        </w:rPr>
+      </w:pPr>
+      <w:r>
+        <w:rPr>
+          <w:rFonts w:ascii="Consolas" w:hAnsi="Consolas"/>
+          <w:sz w:val="19"/>
+        </w:rPr>
+        <w:t xml:space="preserve">        {</w:t>
+      </w:r>
+    </w:p>
+    <w:p>
+      <w:pPr>
+        <w:pStyle w:val="NoSpacing"/>
+        <w:rPr>
+          <w:rFonts w:ascii="Consolas" w:hAnsi="Consolas"/>
+          <w:sz w:val="19"/>
+        </w:rPr>
+      </w:pPr>
+      <w:r>
+        <w:rPr>
+          <w:rFonts w:ascii="Consolas" w:hAnsi="Consolas"/>
+          <w:sz w:val="19"/>
+        </w:rPr>
+        <w:t xml:space="preserve">            string sandboxRoot = Path.GetFullPath(_currentDirectory) + Path.DirectorySeparatorChar;</w:t>
+      </w:r>
+    </w:p>
+    <w:p>
+      <w:pPr>
+        <w:pStyle w:val="NoSpacing"/>
+        <w:rPr>
+          <w:rFonts w:ascii="Consolas" w:hAnsi="Consolas"/>
+          <w:sz w:val="19"/>
+        </w:rPr>
+      </w:pPr>
+      <w:r>
+        <w:rPr>
+          <w:rFonts w:ascii="Consolas" w:hAnsi="Consolas"/>
+          <w:sz w:val="19"/>
+        </w:rPr>
+        <w:t xml:space="preserve">            string fullPath = Path.GetFullPath(Path.Combine(_currentDirectory, fileName));</w:t>
+      </w:r>
+    </w:p>
+    <w:p>
+      <w:pPr>
+        <w:pStyle w:val="NoSpacing"/>
+        <w:rPr>
+          <w:rFonts w:ascii="Consolas" w:hAnsi="Consolas"/>
+          <w:sz w:val="19"/>
+        </w:rPr>
+      </w:pPr>
+    </w:p>
+    <w:p>
+      <w:pPr>
+        <w:pStyle w:val="NoSpacing"/>
+        <w:rPr>
+          <w:rFonts w:ascii="Consolas" w:hAnsi="Consolas"/>
+          <w:sz w:val="19"/>
+        </w:rPr>
+      </w:pPr>
+      <w:r>
+        <w:rPr>
+          <w:rFonts w:ascii="Consolas" w:hAnsi="Consolas"/>
+          <w:sz w:val="19"/>
+        </w:rPr>
+        <w:t xml:space="preserve">            if (!fullPath.StartsWith(sandboxRoot, StringComparison.OrdinalIgnoreCase))</w:t>
+      </w:r>
+    </w:p>
+    <w:p>
+      <w:pPr>
+        <w:pStyle w:val="NoSpacing"/>
+        <w:rPr>
+          <w:rFonts w:ascii="Consolas" w:hAnsi="Consolas"/>
+          <w:sz w:val="19"/>
+        </w:rPr>
+      </w:pPr>
+      <w:r>
+        <w:rPr>
+          <w:rFonts w:ascii="Consolas" w:hAnsi="Consolas"/>
+          <w:sz w:val="19"/>
+        </w:rPr>
+        <w:t xml:space="preserve">            {</w:t>
+      </w:r>
+    </w:p>
+    <w:p>
+      <w:pPr>
+        <w:pStyle w:val="NoSpacing"/>
+        <w:rPr>
+          <w:rFonts w:ascii="Consolas" w:hAnsi="Consolas"/>
+          <w:sz w:val="19"/>
+        </w:rPr>
+      </w:pPr>
+      <w:r>
+        <w:rPr>
+          <w:rFonts w:ascii="Consolas" w:hAnsi="Consolas"/>
+          <w:sz w:val="19"/>
+        </w:rPr>
+        <w:t xml:space="preserve">                resolvedPath = string.Empty;</w:t>
+      </w:r>
+    </w:p>
+    <w:p>
+      <w:pPr>
+        <w:pStyle w:val="NoSpacing"/>
+        <w:rPr>
+          <w:rFonts w:ascii="Consolas" w:hAnsi="Consolas"/>
+          <w:sz w:val="19"/>
+        </w:rPr>
+      </w:pPr>
+      <w:r>
+        <w:rPr>
+          <w:rFonts w:ascii="Consolas" w:hAnsi="Consolas"/>
+          <w:sz w:val="19"/>
+        </w:rPr>
+        <w:t xml:space="preserve">                error = $"Error: '{fileName}' resolves outside the sandboxed directory and was blocked.";</w:t>
+      </w:r>
+    </w:p>
+    <w:p>
+      <w:pPr>
+        <w:pStyle w:val="NoSpacing"/>
+        <w:rPr>
+          <w:rFonts w:ascii="Consolas" w:hAnsi="Consolas"/>
+          <w:sz w:val="19"/>
+        </w:rPr>
+      </w:pPr>
+      <w:r>
+        <w:rPr>
+          <w:rFonts w:ascii="Consolas" w:hAnsi="Consolas"/>
+          <w:sz w:val="19"/>
+        </w:rPr>
+        <w:t xml:space="preserve">                return false;</w:t>
+      </w:r>
+    </w:p>
+    <w:p>
+      <w:pPr>
+        <w:pStyle w:val="NoSpacing"/>
+        <w:rPr>
+          <w:rFonts w:ascii="Consolas" w:hAnsi="Consolas"/>
+          <w:sz w:val="19"/>
+        </w:rPr>
+      </w:pPr>
+      <w:r>
+        <w:rPr>
+          <w:rFonts w:ascii="Consolas" w:hAnsi="Consolas"/>
+          <w:sz w:val="19"/>
+        </w:rPr>
+        <w:t xml:space="preserve">            }</w:t>
+      </w:r>
+    </w:p>
+    <w:p>
+      <w:pPr>
+        <w:pStyle w:val="NoSpacing"/>
+        <w:rPr>
+          <w:rFonts w:ascii="Consolas" w:hAnsi="Consolas"/>
+          <w:sz w:val="19"/>
+        </w:rPr>
+      </w:pPr>
+    </w:p>
+    <w:p>
+      <w:pPr>
+        <w:pStyle w:val="NoSpacing"/>
+        <w:rPr>
+          <w:rFonts w:ascii="Consolas" w:hAnsi="Consolas"/>
+          <w:sz w:val="19"/>
+        </w:rPr>
+      </w:pPr>
+      <w:r>
+        <w:rPr>
+          <w:rFonts w:ascii="Consolas" w:hAnsi="Consolas"/>
+          <w:sz w:val="19"/>
+        </w:rPr>
+        <w:t xml:space="preserve">            resolvedPath = fullPath;</w:t>
+      </w:r>
+    </w:p>
+    <w:p>
+      <w:pPr>
+        <w:pStyle w:val="NoSpacing"/>
+        <w:rPr>
+          <w:rFonts w:ascii="Consolas" w:hAnsi="Consolas"/>
+          <w:sz w:val="19"/>
+        </w:rPr>
+      </w:pPr>
+      <w:r>
+        <w:rPr>
+          <w:rFonts w:ascii="Consolas" w:hAnsi="Consolas"/>
+          <w:sz w:val="19"/>
+        </w:rPr>
+        <w:t xml:space="preserve">            error = string.Empty;</w:t>
+      </w:r>
+    </w:p>
+    <w:p>
+      <w:pPr>
+        <w:pStyle w:val="NoSpacing"/>
+        <w:rPr>
+          <w:rFonts w:ascii="Consolas" w:hAnsi="Consolas"/>
+          <w:sz w:val="19"/>
+        </w:rPr>
+      </w:pPr>
+      <w:r>
+        <w:rPr>
+          <w:rFonts w:ascii="Consolas" w:hAnsi="Consolas"/>
+          <w:sz w:val="19"/>
+        </w:rPr>
+        <w:t xml:space="preserve">            return true;</w:t>
+      </w:r>
+    </w:p>
+    <w:p>
+      <w:pPr>
+        <w:pStyle w:val="NoSpacing"/>
+        <w:rPr>
+          <w:rFonts w:ascii="Consolas" w:hAnsi="Consolas"/>
+          <w:sz w:val="19"/>
+        </w:rPr>
+      </w:pPr>
+      <w:r>
+        <w:rPr>
+          <w:rFonts w:ascii="Consolas" w:hAnsi="Consolas"/>
+          <w:sz w:val="19"/>
+        </w:rPr>
+        <w:t xml:space="preserve">        }</w:t>
+      </w:r>
+    </w:p>
+    <w:p>
+      <w:pPr>
+        <w:pStyle w:val="NoSpacing"/>
+        <w:rPr>
+          <w:rFonts w:ascii="Consolas" w:hAnsi="Consolas"/>
+          <w:sz w:val="19"/>
+        </w:rPr>
+      </w:pPr>
+    </w:p>
+    <w:p>
+      <w:pPr>
+        <w:pStyle w:val="NoSpacing"/>
+        <w:rPr>
+          <w:rFonts w:ascii="Consolas" w:hAnsi="Consolas"/>
+          <w:sz w:val="19"/>
+        </w:rPr>
+      </w:pPr>
+      <w:r>
+        <w:rPr>
+          <w:rFonts w:ascii="Consolas" w:hAnsi="Consolas"/>
+          <w:sz w:val="19"/>
+        </w:rPr>
         <w:t xml:space="preserve">        [KernelFunction("ListFiles")]</w:t>
       </w:r>
     </w:p>
@@ -951,31 +1252,394 @@
           <w:rFonts w:ascii="Consolas" w:hAnsi="Consolas"/>
           <w:sz w:val="19"/>
         </w:rPr>
-        <w:t xml:space="preserve">        [Descript</w:t>
-      </w:r>
+        <w:t xml:space="preserve">        [Description("Reads and returns the text content of a specified file")]</w:t>
+      </w:r>
+    </w:p>
+    <w:p>
+      <w:pPr>
+        <w:pStyle w:val="NoSpacing"/>
+        <w:rPr>
+          <w:rFonts w:ascii="Consolas" w:hAnsi="Consolas"/>
+          <w:sz w:val="19"/>
+        </w:rPr>
+      </w:pPr>
+      <w:r>
+        <w:rPr>
+          <w:rFonts w:ascii="Consolas" w:hAnsi="Consolas"/>
+          <w:sz w:val="19"/>
+        </w:rPr>
+        <w:t xml:space="preserve">        public async Task&lt;string&gt; ReadFileAsync([Description("The exact name of the file to read (e.g. 'document.txt')")] string fileName)</w:t>
+      </w:r>
+    </w:p>
+    <w:p>
+      <w:pPr>
+        <w:pStyle w:val="NoSpacing"/>
+        <w:rPr>
+          <w:rFonts w:ascii="Consolas" w:hAnsi="Consolas"/>
+          <w:sz w:val="19"/>
+        </w:rPr>
+      </w:pPr>
+      <w:r>
+        <w:rPr>
+          <w:rFonts w:ascii="Consolas" w:hAnsi="Consolas"/>
+          <w:sz w:val="19"/>
+        </w:rPr>
+        <w:t xml:space="preserve">        {</w:t>
+      </w:r>
+    </w:p>
+    <w:p>
+      <w:pPr>
+        <w:pStyle w:val="NoSpacing"/>
+        <w:rPr>
+          <w:rFonts w:ascii="Consolas" w:hAnsi="Consolas"/>
+          <w:sz w:val="19"/>
+        </w:rPr>
+      </w:pPr>
+      <w:r>
+        <w:rPr>
+          <w:rFonts w:ascii="Consolas" w:hAnsi="Consolas"/>
+          <w:sz w:val="19"/>
+        </w:rPr>
+        <w:t xml:space="preserve">            Console.WriteLine($"[PLUGIN EXECUTING] AI is reading file: '{fileName}'...");</w:t>
+      </w:r>
+    </w:p>
+    <w:p>
+      <w:pPr>
+        <w:pStyle w:val="NoSpacing"/>
+        <w:rPr>
+          <w:rFonts w:ascii="Consolas" w:hAnsi="Consolas"/>
+          <w:sz w:val="19"/>
+        </w:rPr>
+      </w:pPr>
+      <w:r>
+        <w:rPr>
+          <w:rFonts w:ascii="Consolas" w:hAnsi="Consolas"/>
+          <w:sz w:val="19"/>
+        </w:rPr>
+        <w:t xml:space="preserve">            if (!TryResolveSandboxedPath(fileName, out string path, out string sandboxError)) return sandboxError;</w:t>
+      </w:r>
+    </w:p>
+    <w:p>
+      <w:pPr>
+        <w:pStyle w:val="NoSpacing"/>
+        <w:rPr>
+          <w:rFonts w:ascii="Consolas" w:hAnsi="Consolas"/>
+          <w:sz w:val="19"/>
+        </w:rPr>
+      </w:pPr>
       <w:r>
         <w:rPr>
           <w:rFonts w:ascii="Consolas" w:hAnsi="Consolas"/>
           <w:sz w:val="19"/>
         </w:rPr>
         <w:lastRenderedPageBreak/>
-        <w:t>ion("Reads and returns the text content of a specified file")]</w:t>
-      </w:r>
-    </w:p>
-    <w:p>
-      <w:pPr>
-        <w:pStyle w:val="NoSpacing"/>
-        <w:rPr>
-          <w:rFonts w:ascii="Consolas" w:hAnsi="Consolas"/>
-          <w:sz w:val="19"/>
-        </w:rPr>
-      </w:pPr>
-      <w:r>
-        <w:rPr>
-          <w:rFonts w:ascii="Consolas" w:hAnsi="Consolas"/>
-          <w:sz w:val="19"/>
-        </w:rPr>
-        <w:t xml:space="preserve">        public async Task&lt;string&gt; ReadFileAsync([Description("The exact name of the file to read (e.g. 'document.txt')")] string fileName)</w:t>
+        <w:t xml:space="preserve">            if (!File.Exists(path)) return $"Error: the file '{fileName}' does not exist.";</w:t>
+      </w:r>
+    </w:p>
+    <w:p>
+      <w:pPr>
+        <w:pStyle w:val="NoSpacing"/>
+        <w:rPr>
+          <w:rFonts w:ascii="Consolas" w:hAnsi="Consolas"/>
+          <w:sz w:val="19"/>
+        </w:rPr>
+      </w:pPr>
+    </w:p>
+    <w:p>
+      <w:pPr>
+        <w:pStyle w:val="NoSpacing"/>
+        <w:rPr>
+          <w:rFonts w:ascii="Consolas" w:hAnsi="Consolas"/>
+          <w:sz w:val="19"/>
+        </w:rPr>
+      </w:pPr>
+      <w:r>
+        <w:rPr>
+          <w:rFonts w:ascii="Consolas" w:hAnsi="Consolas"/>
+          <w:sz w:val="19"/>
+        </w:rPr>
+        <w:t xml:space="preserve">            try</w:t>
+      </w:r>
+    </w:p>
+    <w:p>
+      <w:pPr>
+        <w:pStyle w:val="NoSpacing"/>
+        <w:rPr>
+          <w:rFonts w:ascii="Consolas" w:hAnsi="Consolas"/>
+          <w:sz w:val="19"/>
+        </w:rPr>
+      </w:pPr>
+      <w:r>
+        <w:rPr>
+          <w:rFonts w:ascii="Consolas" w:hAnsi="Consolas"/>
+          <w:sz w:val="19"/>
+        </w:rPr>
+        <w:t xml:space="preserve">            {</w:t>
+      </w:r>
+    </w:p>
+    <w:p>
+      <w:pPr>
+        <w:pStyle w:val="NoSpacing"/>
+        <w:rPr>
+          <w:rFonts w:ascii="Consolas" w:hAnsi="Consolas"/>
+          <w:sz w:val="19"/>
+        </w:rPr>
+      </w:pPr>
+      <w:r>
+        <w:rPr>
+          <w:rFonts w:ascii="Consolas" w:hAnsi="Consolas"/>
+          <w:sz w:val="19"/>
+        </w:rPr>
+        <w:t xml:space="preserve">            return await File.ReadAllTextAsync(path);</w:t>
+      </w:r>
+    </w:p>
+    <w:p>
+      <w:pPr>
+        <w:pStyle w:val="NoSpacing"/>
+        <w:rPr>
+          <w:rFonts w:ascii="Consolas" w:hAnsi="Consolas"/>
+          <w:sz w:val="19"/>
+        </w:rPr>
+      </w:pPr>
+      <w:r>
+        <w:rPr>
+          <w:rFonts w:ascii="Consolas" w:hAnsi="Consolas"/>
+          <w:sz w:val="19"/>
+        </w:rPr>
+        <w:t xml:space="preserve">            }</w:t>
+      </w:r>
+    </w:p>
+    <w:p>
+      <w:pPr>
+        <w:pStyle w:val="NoSpacing"/>
+        <w:rPr>
+          <w:rFonts w:ascii="Consolas" w:hAnsi="Consolas"/>
+          <w:sz w:val="19"/>
+        </w:rPr>
+      </w:pPr>
+      <w:r>
+        <w:rPr>
+          <w:rFonts w:ascii="Consolas" w:hAnsi="Consolas"/>
+          <w:sz w:val="19"/>
+        </w:rPr>
+        <w:t xml:space="preserve">            catch (Exception ex) when (ex is IOException || ex is UnauthorizedAccessException)</w:t>
+      </w:r>
+    </w:p>
+    <w:p>
+      <w:pPr>
+        <w:pStyle w:val="NoSpacing"/>
+        <w:rPr>
+          <w:rFonts w:ascii="Consolas" w:hAnsi="Consolas"/>
+          <w:sz w:val="19"/>
+        </w:rPr>
+      </w:pPr>
+      <w:r>
+        <w:rPr>
+          <w:rFonts w:ascii="Consolas" w:hAnsi="Consolas"/>
+          <w:sz w:val="19"/>
+        </w:rPr>
+        <w:t xml:space="preserve">            {</w:t>
+      </w:r>
+    </w:p>
+    <w:p>
+      <w:pPr>
+        <w:pStyle w:val="NoSpacing"/>
+        <w:rPr>
+          <w:rFonts w:ascii="Consolas" w:hAnsi="Consolas"/>
+          <w:sz w:val="19"/>
+        </w:rPr>
+      </w:pPr>
+      <w:r>
+        <w:rPr>
+          <w:rFonts w:ascii="Consolas" w:hAnsi="Consolas"/>
+          <w:sz w:val="19"/>
+        </w:rPr>
+        <w:t xml:space="preserve">                // A locked, permission-denied, or otherwise unreadable file must not</w:t>
+      </w:r>
+    </w:p>
+    <w:p>
+      <w:pPr>
+        <w:pStyle w:val="NoSpacing"/>
+        <w:rPr>
+          <w:rFonts w:ascii="Consolas" w:hAnsi="Consolas"/>
+          <w:sz w:val="19"/>
+        </w:rPr>
+      </w:pPr>
+      <w:r>
+        <w:rPr>
+          <w:rFonts w:ascii="Consolas" w:hAnsi="Consolas"/>
+          <w:sz w:val="19"/>
+        </w:rPr>
+        <w:t xml:space="preserve">                // throw uncaught here - that would crash the whole chat loop instead</w:t>
+      </w:r>
+    </w:p>
+    <w:p>
+      <w:pPr>
+        <w:pStyle w:val="NoSpacing"/>
+        <w:rPr>
+          <w:rFonts w:ascii="Consolas" w:hAnsi="Consolas"/>
+          <w:sz w:val="19"/>
+        </w:rPr>
+      </w:pPr>
+      <w:r>
+        <w:rPr>
+          <w:rFonts w:ascii="Consolas" w:hAnsi="Consolas"/>
+          <w:sz w:val="19"/>
+        </w:rPr>
+        <w:t xml:space="preserve">                // of letting the AI see and react to a normal tool failure.</w:t>
+      </w:r>
+    </w:p>
+    <w:p>
+      <w:pPr>
+        <w:pStyle w:val="NoSpacing"/>
+        <w:rPr>
+          <w:rFonts w:ascii="Consolas" w:hAnsi="Consolas"/>
+          <w:sz w:val="19"/>
+        </w:rPr>
+      </w:pPr>
+      <w:r>
+        <w:rPr>
+          <w:rFonts w:ascii="Consolas" w:hAnsi="Consolas"/>
+          <w:sz w:val="19"/>
+        </w:rPr>
+        <w:t xml:space="preserve">                return $"Error: could not read '{fileName}' ({ex.Message}).";</w:t>
+      </w:r>
+    </w:p>
+    <w:p>
+      <w:pPr>
+        <w:pStyle w:val="NoSpacing"/>
+        <w:rPr>
+          <w:rFonts w:ascii="Consolas" w:hAnsi="Consolas"/>
+          <w:sz w:val="19"/>
+        </w:rPr>
+      </w:pPr>
+      <w:r>
+        <w:rPr>
+          <w:rFonts w:ascii="Consolas" w:hAnsi="Consolas"/>
+          <w:sz w:val="19"/>
+        </w:rPr>
+        <w:t xml:space="preserve">            }</w:t>
+      </w:r>
+    </w:p>
+    <w:p>
+      <w:pPr>
+        <w:pStyle w:val="NoSpacing"/>
+        <w:rPr>
+          <w:rFonts w:ascii="Consolas" w:hAnsi="Consolas"/>
+          <w:sz w:val="19"/>
+        </w:rPr>
+      </w:pPr>
+      <w:r>
+        <w:rPr>
+          <w:rFonts w:ascii="Consolas" w:hAnsi="Consolas"/>
+          <w:sz w:val="19"/>
+        </w:rPr>
+        <w:t xml:space="preserve">        }</w:t>
+      </w:r>
+    </w:p>
+    <w:p>
+      <w:pPr>
+        <w:pStyle w:val="NoSpacing"/>
+        <w:rPr>
+          <w:rFonts w:ascii="Consolas" w:hAnsi="Consolas"/>
+          <w:sz w:val="19"/>
+        </w:rPr>
+      </w:pPr>
+    </w:p>
+    <w:p>
+      <w:pPr>
+        <w:pStyle w:val="NoSpacing"/>
+        <w:rPr>
+          <w:rFonts w:ascii="Consolas" w:hAnsi="Consolas"/>
+          <w:sz w:val="19"/>
+        </w:rPr>
+      </w:pPr>
+      <w:r>
+        <w:rPr>
+          <w:rFonts w:ascii="Consolas" w:hAnsi="Consolas"/>
+          <w:sz w:val="19"/>
+        </w:rPr>
+        <w:t xml:space="preserve">        [KernelFunction("WriteFile")]</w:t>
+      </w:r>
+    </w:p>
+    <w:p>
+      <w:pPr>
+        <w:pStyle w:val="NoSpacing"/>
+        <w:rPr>
+          <w:rFonts w:ascii="Consolas" w:hAnsi="Consolas"/>
+          <w:sz w:val="19"/>
+        </w:rPr>
+      </w:pPr>
+      <w:r>
+        <w:rPr>
+          <w:rFonts w:ascii="Consolas" w:hAnsi="Consolas"/>
+          <w:sz w:val="19"/>
+        </w:rPr>
+        <w:t xml:space="preserve">        [Description("Writes text content into a specified file.  The the file doesn't exist, it will be created")]</w:t>
+      </w:r>
+    </w:p>
+    <w:p>
+      <w:pPr>
+        <w:pStyle w:val="NoSpacing"/>
+        <w:rPr>
+          <w:rFonts w:ascii="Consolas" w:hAnsi="Consolas"/>
+          <w:sz w:val="19"/>
+        </w:rPr>
+      </w:pPr>
+      <w:r>
+        <w:rPr>
+          <w:rFonts w:ascii="Consolas" w:hAnsi="Consolas"/>
+          <w:sz w:val="19"/>
+        </w:rPr>
+        <w:t xml:space="preserve">        public async Task&lt;string&gt; WriteFileAsync(</w:t>
+      </w:r>
+    </w:p>
+    <w:p>
+      <w:pPr>
+        <w:pStyle w:val="NoSpacing"/>
+        <w:rPr>
+          <w:rFonts w:ascii="Consolas" w:hAnsi="Consolas"/>
+          <w:sz w:val="19"/>
+        </w:rPr>
+      </w:pPr>
+      <w:r>
+        <w:rPr>
+          <w:rFonts w:ascii="Consolas" w:hAnsi="Consolas"/>
+          <w:sz w:val="19"/>
+        </w:rPr>
+        <w:t xml:space="preserve">            [Description("The name of the file to write to (e.g. 'summary.txt')")] string fileName,</w:t>
+      </w:r>
+    </w:p>
+    <w:p>
+      <w:pPr>
+        <w:pStyle w:val="NoSpacing"/>
+        <w:rPr>
+          <w:rFonts w:ascii="Consolas" w:hAnsi="Consolas"/>
+          <w:sz w:val="19"/>
+        </w:rPr>
+      </w:pPr>
+      <w:r>
+        <w:rPr>
+          <w:rFonts w:ascii="Consolas" w:hAnsi="Consolas"/>
+          <w:sz w:val="19"/>
+        </w:rPr>
+        <w:t xml:space="preserve">            [Description("The text content to save inside the file")] string content</w:t>
+      </w:r>
+    </w:p>
+    <w:p>
+      <w:pPr>
+        <w:pStyle w:val="NoSpacing"/>
+        <w:rPr>
+          <w:rFonts w:ascii="Consolas" w:hAnsi="Consolas"/>
+          <w:sz w:val="19"/>
+        </w:rPr>
+      </w:pPr>
+      <w:r>
+        <w:rPr>
+          <w:rFonts w:ascii="Consolas" w:hAnsi="Consolas"/>
+          <w:sz w:val="19"/>
+        </w:rPr>
+        <w:t xml:space="preserve">            )</w:t>
       </w:r>
     </w:p>
     <w:p>
@@ -1007,64 +1671,215 @@
           <w:rFonts w:ascii="Consolas" w:hAnsi="Consolas"/>
           <w:sz w:val="19"/>
         </w:rPr>
-        <w:t xml:space="preserve">            Console.WriteLine($"[PLUGIN EXECUTING] AI is reading file: '{fileName}'...");</w:t>
-      </w:r>
-    </w:p>
-    <w:p>
-      <w:pPr>
-        <w:pStyle w:val="NoSpacing"/>
-        <w:rPr>
-          <w:rFonts w:ascii="Consolas" w:hAnsi="Consolas"/>
-          <w:sz w:val="19"/>
-        </w:rPr>
-      </w:pPr>
-      <w:r>
-        <w:rPr>
-          <w:rFonts w:ascii="Consolas" w:hAnsi="Consolas"/>
-          <w:sz w:val="19"/>
-        </w:rPr>
-        <w:t xml:space="preserve">            string path = Path.Combine(_currentDirectory, fileName);</w:t>
-      </w:r>
-    </w:p>
-    <w:p>
-      <w:pPr>
-        <w:pStyle w:val="NoSpacing"/>
-        <w:rPr>
-          <w:rFonts w:ascii="Consolas" w:hAnsi="Consolas"/>
-          <w:sz w:val="19"/>
-        </w:rPr>
-      </w:pPr>
-      <w:r>
-        <w:rPr>
-          <w:rFonts w:ascii="Consolas" w:hAnsi="Consolas"/>
-          <w:sz w:val="19"/>
-        </w:rPr>
-        <w:t xml:space="preserve">            if (!File.Exists(path)) return $"Error: the file '{fileName}' does not exist.";</w:t>
-      </w:r>
-    </w:p>
-    <w:p>
-      <w:pPr>
-        <w:pStyle w:val="NoSpacing"/>
-        <w:rPr>
-          <w:rFonts w:ascii="Consolas" w:hAnsi="Consolas"/>
-          <w:sz w:val="19"/>
-        </w:rPr>
-      </w:pPr>
-    </w:p>
-    <w:p>
-      <w:pPr>
-        <w:pStyle w:val="NoSpacing"/>
-        <w:rPr>
-          <w:rFonts w:ascii="Consolas" w:hAnsi="Consolas"/>
-          <w:sz w:val="19"/>
-        </w:rPr>
-      </w:pPr>
-      <w:r>
-        <w:rPr>
-          <w:rFonts w:ascii="Consolas" w:hAnsi="Consolas"/>
-          <w:sz w:val="19"/>
-        </w:rPr>
-        <w:t xml:space="preserve">            return await File.ReadAllTextAsync(path);</w:t>
+        <w:t xml:space="preserve">            Console.WriteLine($"[PLUGIN EXECUTING] AI is writing data to file: '{fileName}'...");</w:t>
+      </w:r>
+    </w:p>
+    <w:p>
+      <w:pPr>
+        <w:pStyle w:val="NoSpacing"/>
+        <w:rPr>
+          <w:rFonts w:ascii="Consolas" w:hAnsi="Consolas"/>
+          <w:sz w:val="19"/>
+        </w:rPr>
+      </w:pPr>
+      <w:r>
+        <w:rPr>
+          <w:rFonts w:ascii="Consolas" w:hAnsi="Consolas"/>
+          <w:sz w:val="19"/>
+        </w:rPr>
+        <w:t xml:space="preserve">            if (!TryResolveSandboxedPath(fileName, out string path, out string sandboxError)) return sandboxError;</w:t>
+      </w:r>
+    </w:p>
+    <w:p>
+      <w:pPr>
+        <w:pStyle w:val="NoSpacing"/>
+        <w:rPr>
+          <w:rFonts w:ascii="Consolas" w:hAnsi="Consolas"/>
+          <w:sz w:val="19"/>
+        </w:rPr>
+      </w:pPr>
+      <w:r>
+        <w:rPr>
+          <w:rFonts w:ascii="Consolas" w:hAnsi="Consolas"/>
+          <w:sz w:val="19"/>
+        </w:rPr>
+        <w:t xml:space="preserve">            try</w:t>
+      </w:r>
+    </w:p>
+    <w:p>
+      <w:pPr>
+        <w:pStyle w:val="NoSpacing"/>
+        <w:rPr>
+          <w:rFonts w:ascii="Consolas" w:hAnsi="Consolas"/>
+          <w:sz w:val="19"/>
+        </w:rPr>
+      </w:pPr>
+      <w:r>
+        <w:rPr>
+          <w:rFonts w:ascii="Consolas" w:hAnsi="Consolas"/>
+          <w:sz w:val="19"/>
+        </w:rPr>
+        <w:t xml:space="preserve">            {</w:t>
+      </w:r>
+    </w:p>
+    <w:p>
+      <w:pPr>
+        <w:pStyle w:val="NoSpacing"/>
+        <w:rPr>
+          <w:rFonts w:ascii="Consolas" w:hAnsi="Consolas"/>
+          <w:sz w:val="19"/>
+        </w:rPr>
+      </w:pPr>
+      <w:r>
+        <w:rPr>
+          <w:rFonts w:ascii="Consolas" w:hAnsi="Consolas"/>
+          <w:sz w:val="19"/>
+        </w:rPr>
+        <w:t xml:space="preserve">            await File.WriteAllTextAsync(path, content);</w:t>
+      </w:r>
+    </w:p>
+    <w:p>
+      <w:pPr>
+        <w:pStyle w:val="NoSpacing"/>
+        <w:rPr>
+          <w:rFonts w:ascii="Consolas" w:hAnsi="Consolas"/>
+          <w:sz w:val="19"/>
+        </w:rPr>
+      </w:pPr>
+      <w:r>
+        <w:rPr>
+          <w:rFonts w:ascii="Consolas" w:hAnsi="Consolas"/>
+          <w:sz w:val="19"/>
+        </w:rPr>
+        <w:t xml:space="preserve">            }</w:t>
+      </w:r>
+    </w:p>
+    <w:p>
+      <w:pPr>
+        <w:pStyle w:val="NoSpacing"/>
+        <w:rPr>
+          <w:rFonts w:ascii="Consolas" w:hAnsi="Consolas"/>
+          <w:sz w:val="19"/>
+        </w:rPr>
+      </w:pPr>
+      <w:r>
+        <w:rPr>
+          <w:rFonts w:ascii="Consolas" w:hAnsi="Consolas"/>
+          <w:sz w:val="19"/>
+        </w:rPr>
+        <w:t xml:space="preserve">            catch (Exception ex) when (ex is IOException || ex is UnauthorizedAccessException)</w:t>
+      </w:r>
+    </w:p>
+    <w:p>
+      <w:pPr>
+        <w:pStyle w:val="NoSpacing"/>
+        <w:rPr>
+          <w:rFonts w:ascii="Consolas" w:hAnsi="Consolas"/>
+          <w:sz w:val="19"/>
+        </w:rPr>
+      </w:pPr>
+      <w:r>
+        <w:rPr>
+          <w:rFonts w:ascii="Consolas" w:hAnsi="Consolas"/>
+          <w:sz w:val="19"/>
+        </w:rPr>
+        <w:t xml:space="preserve">            {</w:t>
+      </w:r>
+    </w:p>
+    <w:p>
+      <w:pPr>
+        <w:pStyle w:val="NoSpacing"/>
+        <w:rPr>
+          <w:rFonts w:ascii="Consolas" w:hAnsi="Consolas"/>
+          <w:sz w:val="19"/>
+        </w:rPr>
+      </w:pPr>
+      <w:r>
+        <w:rPr>
+          <w:rFonts w:ascii="Consolas" w:hAnsi="Consolas"/>
+          <w:sz w:val="19"/>
+        </w:rPr>
+        <w:t xml:space="preserve">                // Same reasoning as ReadFileAsync: report the disk failure back to the</w:t>
+      </w:r>
+    </w:p>
+    <w:p>
+      <w:pPr>
+        <w:pStyle w:val="NoSpacing"/>
+        <w:rPr>
+          <w:rFonts w:ascii="Consolas" w:hAnsi="Consolas"/>
+          <w:sz w:val="19"/>
+        </w:rPr>
+      </w:pPr>
+      <w:r>
+        <w:rPr>
+          <w:rFonts w:ascii="Consolas" w:hAnsi="Consolas"/>
+          <w:sz w:val="19"/>
+        </w:rPr>
+        <w:t xml:space="preserve">                // AI as a tool result rather than letting it crash the whole session.</w:t>
+      </w:r>
+    </w:p>
+    <w:p>
+      <w:pPr>
+        <w:pStyle w:val="NoSpacing"/>
+        <w:rPr>
+          <w:rFonts w:ascii="Consolas" w:hAnsi="Consolas"/>
+          <w:sz w:val="19"/>
+        </w:rPr>
+      </w:pPr>
+      <w:r>
+        <w:rPr>
+          <w:rFonts w:ascii="Consolas" w:hAnsi="Consolas"/>
+          <w:sz w:val="19"/>
+        </w:rPr>
+        <w:t xml:space="preserve">                return $"Error: could not write '{fileName}' ({ex.Message}).";</w:t>
+      </w:r>
+    </w:p>
+    <w:p>
+      <w:pPr>
+        <w:pStyle w:val="NoSpacing"/>
+        <w:rPr>
+          <w:rFonts w:ascii="Consolas" w:hAnsi="Consolas"/>
+          <w:sz w:val="19"/>
+        </w:rPr>
+      </w:pPr>
+      <w:r>
+        <w:rPr>
+          <w:rFonts w:ascii="Consolas" w:hAnsi="Consolas"/>
+          <w:sz w:val="19"/>
+        </w:rPr>
+        <w:t xml:space="preserve">            }</w:t>
+      </w:r>
+    </w:p>
+    <w:p>
+      <w:pPr>
+        <w:pStyle w:val="NoSpacing"/>
+        <w:rPr>
+          <w:rFonts w:ascii="Consolas" w:hAnsi="Consolas"/>
+          <w:sz w:val="19"/>
+        </w:rPr>
+      </w:pPr>
+    </w:p>
+    <w:p>
+      <w:pPr>
+        <w:pStyle w:val="NoSpacing"/>
+        <w:rPr>
+          <w:rFonts w:ascii="Consolas" w:hAnsi="Consolas"/>
+          <w:sz w:val="19"/>
+        </w:rPr>
+      </w:pPr>
+      <w:r>
+        <w:rPr>
+          <w:rFonts w:ascii="Consolas" w:hAnsi="Consolas"/>
+          <w:sz w:val="19"/>
+        </w:rPr>
+        <w:t xml:space="preserve">            return $"Success</w:t>
+      </w:r>
+      <w:r>
+        <w:rPr>
+          <w:rFonts w:ascii="Consolas" w:hAnsi="Consolas"/>
+          <w:sz w:val="19"/>
+        </w:rPr>
+        <w:t>: The file '{fileName}' was successfully created and written";</w:t>
       </w:r>
     </w:p>
     <w:p>
@@ -1091,101 +1906,69 @@
           <w:sz w:val="19"/>
         </w:rPr>
       </w:pPr>
-    </w:p>
-    <w:p>
-      <w:pPr>
-        <w:pStyle w:val="NoSpacing"/>
-        <w:rPr>
-          <w:rFonts w:ascii="Consolas" w:hAnsi="Consolas"/>
-          <w:sz w:val="19"/>
-        </w:rPr>
-      </w:pPr>
-      <w:r>
-        <w:rPr>
-          <w:rFonts w:ascii="Consolas" w:hAnsi="Consolas"/>
-          <w:sz w:val="19"/>
-        </w:rPr>
-        <w:t xml:space="preserve">        [KernelFunction("WriteFile")]</w:t>
-      </w:r>
-    </w:p>
-    <w:p>
-      <w:pPr>
-        <w:pStyle w:val="NoSpacing"/>
-        <w:rPr>
-          <w:rFonts w:ascii="Consolas" w:hAnsi="Consolas"/>
-          <w:sz w:val="19"/>
-        </w:rPr>
-      </w:pPr>
-      <w:r>
-        <w:rPr>
-          <w:rFonts w:ascii="Consolas" w:hAnsi="Consolas"/>
-          <w:sz w:val="19"/>
-        </w:rPr>
-        <w:t xml:space="preserve">        [Description("Writes text content into a specified file.  The the file doesn't exist, it will be created")]</w:t>
-      </w:r>
-    </w:p>
-    <w:p>
-      <w:pPr>
-        <w:pStyle w:val="NoSpacing"/>
-        <w:rPr>
-          <w:rFonts w:ascii="Consolas" w:hAnsi="Consolas"/>
-          <w:sz w:val="19"/>
-        </w:rPr>
-      </w:pPr>
-      <w:r>
-        <w:rPr>
-          <w:rFonts w:ascii="Consolas" w:hAnsi="Consolas"/>
-          <w:sz w:val="19"/>
-        </w:rPr>
-        <w:t xml:space="preserve">        public async Task&lt;string&gt; WriteFileAsync(</w:t>
-      </w:r>
-    </w:p>
-    <w:p>
-      <w:pPr>
-        <w:pStyle w:val="NoSpacing"/>
-        <w:rPr>
-          <w:rFonts w:ascii="Consolas" w:hAnsi="Consolas"/>
-          <w:sz w:val="19"/>
-        </w:rPr>
-      </w:pPr>
-      <w:r>
-        <w:rPr>
-          <w:rFonts w:ascii="Consolas" w:hAnsi="Consolas"/>
-          <w:sz w:val="19"/>
-        </w:rPr>
-        <w:t xml:space="preserve">            [Description("The name of the file to write to (e.g. 'summary.txt')")] string fileName,</w:t>
-      </w:r>
-    </w:p>
-    <w:p>
-      <w:pPr>
-        <w:pStyle w:val="NoSpacing"/>
-        <w:rPr>
-          <w:rFonts w:ascii="Consolas" w:hAnsi="Consolas"/>
-          <w:sz w:val="19"/>
-        </w:rPr>
-      </w:pPr>
-      <w:r>
-        <w:rPr>
-          <w:rFonts w:ascii="Consolas" w:hAnsi="Consolas"/>
-          <w:sz w:val="19"/>
-        </w:rPr>
-        <w:t xml:space="preserve">            [Description("The text content to save inside the file")] string content</w:t>
-      </w:r>
-    </w:p>
-    <w:p>
-      <w:pPr>
-        <w:pStyle w:val="NoSpacing"/>
-        <w:rPr>
-          <w:rFonts w:ascii="Consolas" w:hAnsi="Consolas"/>
-          <w:sz w:val="19"/>
-        </w:rPr>
-      </w:pPr>
-      <w:r>
-        <w:rPr>
-          <w:rFonts w:ascii="Consolas" w:hAnsi="Consolas"/>
-          <w:sz w:val="19"/>
-        </w:rPr>
-        <w:t xml:space="preserve">            )</w:t>
+      <w:r>
+        <w:rPr>
+          <w:rFonts w:ascii="Consolas" w:hAnsi="Consolas"/>
+          <w:sz w:val="19"/>
+        </w:rPr>
+        <w:t xml:space="preserve">    }</w:t>
+      </w:r>
+    </w:p>
+    <w:p>
+      <w:pPr>
+        <w:pStyle w:val="NoSpacing"/>
+        <w:rPr>
+          <w:rFonts w:ascii="Consolas" w:hAnsi="Consolas"/>
+          <w:sz w:val="19"/>
+        </w:rPr>
+      </w:pPr>
+    </w:p>
+    <w:p>
+      <w:pPr>
+        <w:pStyle w:val="NoSpacing"/>
+        <w:rPr>
+          <w:rFonts w:ascii="Consolas" w:hAnsi="Consolas"/>
+          <w:sz w:val="19"/>
+        </w:rPr>
+      </w:pPr>
+      <w:r>
+        <w:rPr>
+          <w:rFonts w:ascii="Consolas" w:hAnsi="Consolas"/>
+          <w:sz w:val="19"/>
+        </w:rPr>
+        <w:t xml:space="preserve">    class Program</w:t>
+      </w:r>
+    </w:p>
+    <w:p>
+      <w:pPr>
+        <w:pStyle w:val="NoSpacing"/>
+        <w:rPr>
+          <w:rFonts w:ascii="Consolas" w:hAnsi="Consolas"/>
+          <w:sz w:val="19"/>
+        </w:rPr>
+      </w:pPr>
+      <w:r>
+        <w:rPr>
+          <w:rFonts w:ascii="Consolas" w:hAnsi="Consolas"/>
+          <w:sz w:val="19"/>
+        </w:rPr>
+        <w:t xml:space="preserve">    {</w:t>
+      </w:r>
+    </w:p>
+    <w:p>
+      <w:pPr>
+        <w:pStyle w:val="NoSpacing"/>
+        <w:rPr>
+          <w:rFonts w:ascii="Consolas" w:hAnsi="Consolas"/>
+          <w:sz w:val="19"/>
+        </w:rPr>
+      </w:pPr>
+      <w:r>
+        <w:rPr>
+          <w:rFonts w:ascii="Consolas" w:hAnsi="Consolas"/>
+          <w:sz w:val="19"/>
+        </w:rPr>
+        <w:t xml:space="preserve">        static async Task Main(string[] args)</w:t>
       </w:r>
     </w:p>
     <w:p>
@@ -1217,72 +2000,893 @@
           <w:rFonts w:ascii="Consolas" w:hAnsi="Consolas"/>
           <w:sz w:val="19"/>
         </w:rPr>
-        <w:t xml:space="preserve">            Console.WriteLine($"[PLUGIN EXECUTING] AI is writing data to file: '{fileName}'...");</w:t>
-      </w:r>
-    </w:p>
-    <w:p>
-      <w:pPr>
-        <w:pStyle w:val="NoSpacing"/>
-        <w:rPr>
-          <w:rFonts w:ascii="Consolas" w:hAnsi="Consolas"/>
-          <w:sz w:val="19"/>
-        </w:rPr>
-      </w:pPr>
-      <w:r>
-        <w:rPr>
-          <w:rFonts w:ascii="Consolas" w:hAnsi="Consolas"/>
-          <w:sz w:val="19"/>
-        </w:rPr>
-        <w:t xml:space="preserve">            string path = Path.Combine(_currentDirectory, fileName);</w:t>
-      </w:r>
-    </w:p>
-    <w:p>
-      <w:pPr>
-        <w:pStyle w:val="NoSpacing"/>
-        <w:rPr>
-          <w:rFonts w:ascii="Consolas" w:hAnsi="Consolas"/>
-          <w:sz w:val="19"/>
-        </w:rPr>
-      </w:pPr>
-      <w:r>
-        <w:rPr>
-          <w:rFonts w:ascii="Consolas" w:hAnsi="Consolas"/>
-          <w:sz w:val="19"/>
-        </w:rPr>
-        <w:t xml:space="preserve">            await File.WriteAllTextAsync(path, content);</w:t>
-      </w:r>
-    </w:p>
-    <w:p>
-      <w:pPr>
-        <w:pStyle w:val="NoSpacing"/>
-        <w:rPr>
-          <w:rFonts w:ascii="Consolas" w:hAnsi="Consolas"/>
-          <w:sz w:val="19"/>
-        </w:rPr>
-      </w:pPr>
-    </w:p>
-    <w:p>
-      <w:pPr>
-        <w:pStyle w:val="NoSpacing"/>
-        <w:rPr>
-          <w:rFonts w:ascii="Consolas" w:hAnsi="Consolas"/>
-          <w:sz w:val="19"/>
-        </w:rPr>
-      </w:pPr>
-      <w:r>
-        <w:rPr>
-          <w:rFonts w:ascii="Consolas" w:hAnsi="Consolas"/>
-          <w:sz w:val="19"/>
-        </w:rPr>
-        <w:t xml:space="preserve">            return $"Success: The file '{fil</w:t>
-      </w:r>
+        <w:t xml:space="preserve">            // Step 2: Setup the Dummy Log File for the AI to find</w:t>
+      </w:r>
+    </w:p>
+    <w:p>
+      <w:pPr>
+        <w:pStyle w:val="NoSpacing"/>
+        <w:rPr>
+          <w:rFonts w:ascii="Consolas" w:hAnsi="Consolas"/>
+          <w:sz w:val="19"/>
+        </w:rPr>
+      </w:pPr>
+      <w:r>
+        <w:rPr>
+          <w:rFonts w:ascii="Consolas" w:hAnsi="Consolas"/>
+          <w:sz w:val="19"/>
+        </w:rPr>
+        <w:t xml:space="preserve">            SetupDummyLogFile();</w:t>
+      </w:r>
+    </w:p>
+    <w:p>
+      <w:pPr>
+        <w:pStyle w:val="NoSpacing"/>
+        <w:rPr>
+          <w:rFonts w:ascii="Consolas" w:hAnsi="Consolas"/>
+          <w:sz w:val="19"/>
+        </w:rPr>
+      </w:pPr>
+    </w:p>
+    <w:p>
+      <w:pPr>
+        <w:pStyle w:val="NoSpacing"/>
+        <w:rPr>
+          <w:rFonts w:ascii="Consolas" w:hAnsi="Consolas"/>
+          <w:sz w:val="19"/>
+        </w:rPr>
+      </w:pPr>
+      <w:r>
+        <w:rPr>
+          <w:rFonts w:ascii="Consolas" w:hAnsi="Consolas"/>
+          <w:sz w:val="19"/>
+        </w:rPr>
+        <w:t xml:space="preserve">            // Step 3: Initialize the Kernel with our model</w:t>
+      </w:r>
+    </w:p>
+    <w:p>
+      <w:pPr>
+        <w:pStyle w:val="NoSpacing"/>
+        <w:rPr>
+          <w:rFonts w:ascii="Consolas" w:hAnsi="Consolas"/>
+          <w:sz w:val="19"/>
+        </w:rPr>
+      </w:pPr>
+      <w:r>
+        <w:rPr>
+          <w:rFonts w:ascii="Consolas" w:hAnsi="Consolas"/>
+          <w:sz w:val="19"/>
+        </w:rPr>
+        <w:t xml:space="preserve">            string apiKey = Environment.GetEnvironmentVariable("GEMINI_API_KEY")</w:t>
+      </w:r>
+    </w:p>
+    <w:p>
+      <w:pPr>
+        <w:pStyle w:val="NoSpacing"/>
+        <w:rPr>
+          <w:rFonts w:ascii="Consolas" w:hAnsi="Consolas"/>
+          <w:sz w:val="19"/>
+        </w:rPr>
+      </w:pPr>
+      <w:r>
+        <w:rPr>
+          <w:rFonts w:ascii="Consolas" w:hAnsi="Consolas"/>
+          <w:sz w:val="19"/>
+        </w:rPr>
+        <w:t xml:space="preserve">                ?? throw new Exception("GEMINI_API_KEY environment variable not set.");</w:t>
+      </w:r>
+    </w:p>
+    <w:p>
+      <w:pPr>
+        <w:pStyle w:val="NoSpacing"/>
+        <w:rPr>
+          <w:rFonts w:ascii="Consolas" w:hAnsi="Consolas"/>
+          <w:sz w:val="19"/>
+        </w:rPr>
+      </w:pPr>
+      <w:r>
+        <w:rPr>
+          <w:rFonts w:ascii="Consolas" w:hAnsi="Consolas"/>
+          <w:sz w:val="19"/>
+        </w:rPr>
+        <w:t xml:space="preserve">            string model = "gemini-2.5-flash";</w:t>
+      </w:r>
+    </w:p>
+    <w:p>
+      <w:pPr>
+        <w:pStyle w:val="NoSpacing"/>
+        <w:rPr>
+          <w:rFonts w:ascii="Consolas" w:hAnsi="Consolas"/>
+          <w:sz w:val="19"/>
+        </w:rPr>
+      </w:pPr>
+    </w:p>
+    <w:p>
+      <w:pPr>
+        <w:pStyle w:val="NoSpacing"/>
+        <w:rPr>
+          <w:rFonts w:ascii="Consolas" w:hAnsi="Consolas"/>
+          <w:sz w:val="19"/>
+        </w:rPr>
+      </w:pPr>
+      <w:r>
+        <w:rPr>
+          <w:rFonts w:ascii="Consolas" w:hAnsi="Consolas"/>
+          <w:sz w:val="19"/>
+        </w:rPr>
+        <w:t xml:space="preserve">            var builder = Kernel.CreateBuilder();</w:t>
+      </w:r>
+    </w:p>
+    <w:p>
+      <w:pPr>
+        <w:pStyle w:val="NoSpacing"/>
+        <w:rPr>
+          <w:rFonts w:ascii="Consolas" w:hAnsi="Consolas"/>
+          <w:sz w:val="19"/>
+        </w:rPr>
+      </w:pPr>
+      <w:r>
+        <w:rPr>
+          <w:rFonts w:ascii="Consolas" w:hAnsi="Consolas"/>
+          <w:sz w:val="19"/>
+        </w:rPr>
+        <w:t xml:space="preserve">            builder.AddGoogleAIGeminiChatCompletion(model, apiKey);</w:t>
+      </w:r>
+    </w:p>
+    <w:p>
+      <w:pPr>
+        <w:pStyle w:val="NoSpacing"/>
+        <w:rPr>
+          <w:rFonts w:ascii="Consolas" w:hAnsi="Consolas"/>
+          <w:sz w:val="19"/>
+        </w:rPr>
+      </w:pPr>
+    </w:p>
+    <w:p>
+      <w:pPr>
+        <w:pStyle w:val="NoSpacing"/>
+        <w:rPr>
+          <w:rFonts w:ascii="Consolas" w:hAnsi="Consolas"/>
+          <w:sz w:val="19"/>
+        </w:rPr>
+      </w:pPr>
+      <w:r>
+        <w:rPr>
+          <w:rFonts w:ascii="Consolas" w:hAnsi="Consolas"/>
+          <w:sz w:val="19"/>
+        </w:rPr>
+        <w:t xml:space="preserve">            // Step 4: Add our file system plugin</w:t>
+      </w:r>
+    </w:p>
+    <w:p>
+      <w:pPr>
+        <w:pStyle w:val="NoSpacing"/>
+        <w:rPr>
+          <w:rFonts w:ascii="Consolas" w:hAnsi="Consolas"/>
+          <w:sz w:val="19"/>
+        </w:rPr>
+      </w:pPr>
+      <w:r>
+        <w:rPr>
+          <w:rFonts w:ascii="Consolas" w:hAnsi="Consolas"/>
+          <w:sz w:val="19"/>
+        </w:rPr>
+        <w:t xml:space="preserve">            builder.Plugins.AddFromObject(new FileSystemPlugin(), "FileSystem");</w:t>
+      </w:r>
+    </w:p>
+    <w:p>
+      <w:pPr>
+        <w:pStyle w:val="NoSpacing"/>
+        <w:rPr>
+          <w:rFonts w:ascii="Consolas" w:hAnsi="Consolas"/>
+          <w:sz w:val="19"/>
+        </w:rPr>
+      </w:pPr>
+    </w:p>
+    <w:p>
+      <w:pPr>
+        <w:pStyle w:val="NoSpacing"/>
+        <w:rPr>
+          <w:rFonts w:ascii="Consolas" w:hAnsi="Consolas"/>
+          <w:sz w:val="19"/>
+        </w:rPr>
+      </w:pPr>
+      <w:r>
+        <w:rPr>
+          <w:rFonts w:ascii="Consolas" w:hAnsi="Consolas"/>
+          <w:sz w:val="19"/>
+        </w:rPr>
+        <w:t xml:space="preserve">            Kernel kernel = builder.Build();</w:t>
+      </w:r>
+    </w:p>
+    <w:p>
+      <w:pPr>
+        <w:pStyle w:val="NoSpacing"/>
+        <w:rPr>
+          <w:rFonts w:ascii="Consolas" w:hAnsi="Consolas"/>
+          <w:sz w:val="19"/>
+        </w:rPr>
+      </w:pPr>
+    </w:p>
+    <w:p>
+      <w:pPr>
+        <w:pStyle w:val="NoSpacing"/>
+        <w:rPr>
+          <w:rFonts w:ascii="Consolas" w:hAnsi="Consolas"/>
+          <w:sz w:val="19"/>
+        </w:rPr>
+      </w:pPr>
+      <w:r>
+        <w:rPr>
+          <w:rFonts w:ascii="Consolas" w:hAnsi="Consolas"/>
+          <w:sz w:val="19"/>
+        </w:rPr>
+        <w:t xml:space="preserve">            // Step 5: Define a multi-step task for the AI</w:t>
+      </w:r>
+    </w:p>
+    <w:p>
+      <w:pPr>
+        <w:pStyle w:val="NoSpacing"/>
+        <w:rPr>
+          <w:rFonts w:ascii="Consolas" w:hAnsi="Consolas"/>
+          <w:sz w:val="19"/>
+        </w:rPr>
+      </w:pPr>
+      <w:r>
+        <w:rPr>
+          <w:rFonts w:ascii="Consolas" w:hAnsi="Consolas"/>
+          <w:sz w:val="19"/>
+        </w:rPr>
+        <w:t xml:space="preserve">            string prompt = "Look in the current directory for a server log file.  Read its contents, figure out what errors occurred, and write a summary of those errors into a new file called 'error_summary.txt'.";</w:t>
+      </w:r>
+    </w:p>
+    <w:p>
+      <w:pPr>
+        <w:pStyle w:val="NoSpacing"/>
+        <w:rPr>
+          <w:rFonts w:ascii="Consolas" w:hAnsi="Consolas"/>
+          <w:sz w:val="19"/>
+        </w:rPr>
+      </w:pPr>
+    </w:p>
+    <w:p>
+      <w:pPr>
+        <w:pStyle w:val="NoSpacing"/>
+        <w:rPr>
+          <w:rFonts w:ascii="Consolas" w:hAnsi="Consolas"/>
+          <w:sz w:val="19"/>
+        </w:rPr>
+      </w:pPr>
+      <w:r>
+        <w:rPr>
+          <w:rFonts w:ascii="Consolas" w:hAnsi="Consolas"/>
+          <w:sz w:val="19"/>
+        </w:rPr>
+        <w:t xml:space="preserve">            // Step 6: Enable Auto-Invocation so the AI can chain the tools</w:t>
+      </w:r>
+    </w:p>
+    <w:p>
+      <w:pPr>
+        <w:pStyle w:val="NoSpacing"/>
+        <w:rPr>
+          <w:rFonts w:ascii="Consolas" w:hAnsi="Consolas"/>
+          <w:sz w:val="19"/>
+        </w:rPr>
+      </w:pPr>
+      <w:r>
+        <w:rPr>
+          <w:rFonts w:ascii="Consolas" w:hAnsi="Consolas"/>
+          <w:sz w:val="19"/>
+        </w:rPr>
+        <w:t xml:space="preserve">            var executionSettings = new GeminiPromptExecutionSettings</w:t>
+      </w:r>
+    </w:p>
+    <w:p>
+      <w:pPr>
+        <w:pStyle w:val="NoSpacing"/>
+        <w:rPr>
+          <w:rFonts w:ascii="Consolas" w:hAnsi="Consolas"/>
+          <w:sz w:val="19"/>
+        </w:rPr>
+      </w:pPr>
+      <w:r>
+        <w:rPr>
+          <w:rFonts w:ascii="Consolas" w:hAnsi="Consolas"/>
+          <w:sz w:val="19"/>
+        </w:rPr>
+        <w:t xml:space="preserve">            {</w:t>
+      </w:r>
+    </w:p>
+    <w:p>
+      <w:pPr>
+        <w:pStyle w:val="NoSpacing"/>
+        <w:rPr>
+          <w:rFonts w:ascii="Consolas" w:hAnsi="Consolas"/>
+          <w:sz w:val="19"/>
+        </w:rPr>
+      </w:pPr>
+      <w:r>
+        <w:rPr>
+          <w:rFonts w:ascii="Consolas" w:hAnsi="Consolas"/>
+          <w:sz w:val="19"/>
+        </w:rPr>
+        <w:t xml:space="preserve">                ToolCallBehavior = GeminiToolCallBehavior.AutoInvokeKernelFunctions,</w:t>
+      </w:r>
+    </w:p>
+    <w:p>
+      <w:pPr>
+        <w:pStyle w:val="NoSpacing"/>
+        <w:rPr>
+          <w:rFonts w:ascii="Consolas" w:hAnsi="Consolas"/>
+          <w:sz w:val="19"/>
+        </w:rPr>
+      </w:pPr>
+      <w:r>
+        <w:rPr>
+          <w:rFonts w:ascii="Consolas" w:hAnsi="Consolas"/>
+          <w:sz w:val="19"/>
+        </w:rPr>
+        <w:t xml:space="preserve">                Temperature = 0.0</w:t>
+      </w:r>
+    </w:p>
+    <w:p>
+      <w:pPr>
+        <w:pStyle w:val="NoSpacing"/>
+        <w:rPr>
+          <w:rFonts w:ascii="Consolas" w:hAnsi="Consolas"/>
+          <w:sz w:val="19"/>
+        </w:rPr>
+      </w:pPr>
+      <w:r>
+        <w:rPr>
+          <w:rFonts w:ascii="Consolas" w:hAnsi="Consolas"/>
+          <w:sz w:val="19"/>
+        </w:rPr>
+        <w:t xml:space="preserve">            };</w:t>
+      </w:r>
+    </w:p>
+    <w:p>
+      <w:pPr>
+        <w:pStyle w:val="NoSpacing"/>
+        <w:rPr>
+          <w:rFonts w:ascii="Consolas" w:hAnsi="Consolas"/>
+          <w:sz w:val="19"/>
+        </w:rPr>
+      </w:pPr>
+    </w:p>
+    <w:p>
+      <w:pPr>
+        <w:pStyle w:val="NoSpacing"/>
+        <w:rPr>
+          <w:rFonts w:ascii="Consolas" w:hAnsi="Consolas"/>
+          <w:sz w:val="19"/>
+        </w:rPr>
+      </w:pPr>
+      <w:r>
+        <w:rPr>
+          <w:rFonts w:ascii="Consolas" w:hAnsi="Consolas"/>
+          <w:sz w:val="19"/>
+        </w:rPr>
+        <w:t xml:space="preserve">            var arguments = new KernelArguments(executionSettings);</w:t>
+      </w:r>
+    </w:p>
+    <w:p>
+      <w:pPr>
+        <w:pStyle w:val="NoSpacing"/>
+        <w:rPr>
+          <w:rFonts w:ascii="Consolas" w:hAnsi="Consolas"/>
+          <w:sz w:val="19"/>
+        </w:rPr>
+      </w:pPr>
+    </w:p>
+    <w:p>
+      <w:pPr>
+        <w:pStyle w:val="NoSpacing"/>
+        <w:rPr>
+          <w:rFonts w:ascii="Consolas" w:hAnsi="Consolas"/>
+          <w:sz w:val="19"/>
+        </w:rPr>
+      </w:pPr>
+      <w:r>
+        <w:rPr>
+          <w:rFonts w:ascii="Consolas" w:hAnsi="Consolas"/>
+          <w:sz w:val="19"/>
+        </w:rPr>
+        <w:t xml:space="preserve">            Console.WriteLine($"Task: {prompt}");</w:t>
+      </w:r>
+    </w:p>
+    <w:p>
+      <w:pPr>
+        <w:pStyle w:val="NoSpacing"/>
+        <w:rPr>
+          <w:rFonts w:ascii="Consolas" w:hAnsi="Consolas"/>
+          <w:sz w:val="19"/>
+        </w:rPr>
+      </w:pPr>
+      <w:r>
+        <w:rPr>
+          <w:rFonts w:ascii="Consolas" w:hAnsi="Consolas"/>
+          <w:sz w:val="19"/>
+        </w:rPr>
+        <w:t xml:space="preserve">            Console.WriteLine("Agent is thinking and interacting with the file system...");</w:t>
+      </w:r>
+    </w:p>
+    <w:p>
+      <w:pPr>
+        <w:pStyle w:val="NoSpacing"/>
+        <w:rPr>
+          <w:rFonts w:ascii="Consolas" w:hAnsi="Consolas"/>
+          <w:sz w:val="19"/>
+        </w:rPr>
+      </w:pPr>
+    </w:p>
+    <w:p>
+      <w:pPr>
+        <w:pStyle w:val="NoSpacing"/>
+        <w:rPr>
+          <w:rFonts w:ascii="Consolas" w:hAnsi="Consolas"/>
+          <w:sz w:val="19"/>
+        </w:rPr>
+      </w:pPr>
+      <w:r>
+        <w:rPr>
+          <w:rFonts w:ascii="Consolas" w:hAnsi="Consolas"/>
+          <w:sz w:val="19"/>
+        </w:rPr>
+        <w:t xml:space="preserve">            // Step 7: Execute the prompt</w:t>
+      </w:r>
+    </w:p>
+    <w:p>
+      <w:pPr>
+        <w:pStyle w:val="NoSpacing"/>
+        <w:rPr>
+          <w:rFonts w:ascii="Consolas" w:hAnsi="Consolas"/>
+          <w:sz w:val="19"/>
+        </w:rPr>
+      </w:pPr>
+      <w:r>
+        <w:rPr>
+          <w:rFonts w:ascii="Consolas" w:hAnsi="Consolas"/>
+          <w:sz w:val="19"/>
+        </w:rPr>
+        <w:t xml:space="preserve">            var result = await kernel.InvokePromptAsync(prompt, arguments);</w:t>
+      </w:r>
+    </w:p>
+    <w:p>
+      <w:pPr>
+        <w:pStyle w:val="NoSpacing"/>
+        <w:rPr>
+          <w:rFonts w:ascii="Consolas" w:hAnsi="Consolas"/>
+          <w:sz w:val="19"/>
+        </w:rPr>
+      </w:pPr>
+    </w:p>
+    <w:p>
+      <w:pPr>
+        <w:pStyle w:val="NoSpacing"/>
+        <w:rPr>
+          <w:rFonts w:ascii="Consolas" w:hAnsi="Consolas"/>
+          <w:sz w:val="19"/>
+        </w:rPr>
+      </w:pPr>
+      <w:r>
+        <w:rPr>
+          <w:rFonts w:ascii="Consolas" w:hAnsi="Consolas"/>
+          <w:sz w:val="19"/>
+        </w:rPr>
+        <w:t xml:space="preserve">            // Step 8: Display the final result</w:t>
+      </w:r>
+    </w:p>
+    <w:p>
+      <w:pPr>
+        <w:pStyle w:val="NoSpacing"/>
+        <w:rPr>
+          <w:rFonts w:ascii="Consolas" w:hAnsi="Consolas"/>
+          <w:sz w:val="19"/>
+        </w:rPr>
+      </w:pPr>
+      <w:r>
+        <w:rPr>
+          <w:rFonts w:ascii="Consolas" w:hAnsi="Consolas"/>
+          <w:sz w:val="19"/>
+        </w:rPr>
+        <w:t xml:space="preserve">            Console.WriteLine("--- AI TASK REPORT ---");</w:t>
+      </w:r>
+    </w:p>
+    <w:p>
+      <w:pPr>
+        <w:pStyle w:val="NoSpacing"/>
+        <w:rPr>
+          <w:rFonts w:ascii="Consolas" w:hAnsi="Consolas"/>
+          <w:sz w:val="19"/>
+        </w:rPr>
+      </w:pPr>
+      <w:r>
+        <w:rPr>
+          <w:rFonts w:ascii="Consolas" w:hAnsi="Consolas"/>
+          <w:sz w:val="19"/>
+        </w:rPr>
+        <w:t xml:space="preserve">            Console.WriteLine(result.ToString().Trim());</w:t>
+      </w:r>
+    </w:p>
+    <w:p>
+      <w:pPr>
+        <w:pStyle w:val="NoSpacing"/>
+        <w:rPr>
+          <w:rFonts w:ascii="Consolas" w:hAnsi="Consolas"/>
+          <w:sz w:val="19"/>
+        </w:rPr>
+      </w:pPr>
+      <w:r>
+        <w:rPr>
+          <w:rFonts w:ascii="Consolas" w:hAnsi="Consolas"/>
+          <w:sz w:val="19"/>
+        </w:rPr>
+        <w:t xml:space="preserve">            Console.WriteLine("----------------------");</w:t>
+      </w:r>
+    </w:p>
+    <w:p>
+      <w:pPr>
+        <w:pStyle w:val="NoSpacing"/>
+        <w:rPr>
+          <w:rFonts w:ascii="Consolas" w:hAnsi="Consolas"/>
+          <w:sz w:val="19"/>
+        </w:rPr>
+      </w:pPr>
+    </w:p>
+    <w:p>
+      <w:pPr>
+        <w:pStyle w:val="NoSpacing"/>
+        <w:rPr>
+          <w:rFonts w:ascii="Consolas" w:hAnsi="Consolas"/>
+          <w:sz w:val="19"/>
+        </w:rPr>
+      </w:pPr>
+      <w:r>
+        <w:rPr>
+          <w:rFonts w:ascii="Consolas" w:hAnsi="Consolas"/>
+          <w:sz w:val="19"/>
+        </w:rPr>
+        <w:t xml:space="preserve">            // Verify the file was actually created on the hard drive</w:t>
+      </w:r>
+    </w:p>
+    <w:p>
+      <w:pPr>
+        <w:pStyle w:val="NoSpacing"/>
+        <w:rPr>
+          <w:rFonts w:ascii="Consolas" w:hAnsi="Consolas"/>
+          <w:sz w:val="19"/>
+        </w:rPr>
+      </w:pPr>
+      <w:r>
+        <w:rPr>
+          <w:rFonts w:ascii="Consolas" w:hAnsi="Consolas"/>
+          <w:sz w:val="19"/>
+        </w:rPr>
+        <w:t xml:space="preserve">            string summaryPath = Path.Combine(Directory.GetCurrentDirectory(), "error_summary.txt");</w:t>
+      </w:r>
+    </w:p>
+    <w:p>
+      <w:pPr>
+        <w:pStyle w:val="NoSpacing"/>
+        <w:rPr>
+          <w:rFonts w:ascii="Consolas" w:hAnsi="Consolas"/>
+          <w:sz w:val="19"/>
+        </w:rPr>
+      </w:pPr>
+      <w:r>
+        <w:rPr>
+          <w:rFonts w:ascii="Consolas" w:hAnsi="Consolas"/>
+          <w:sz w:val="19"/>
+        </w:rPr>
+        <w:t xml:space="preserve">            if (File.Exists(summaryPath))</w:t>
+      </w:r>
+    </w:p>
+    <w:p>
+      <w:pPr>
+        <w:pStyle w:val="NoSpacing"/>
+        <w:rPr>
+          <w:rFonts w:ascii="Consolas" w:hAnsi="Consolas"/>
+          <w:sz w:val="19"/>
+        </w:rPr>
+      </w:pPr>
+      <w:r>
+        <w:rPr>
+          <w:rFonts w:ascii="Consolas" w:hAnsi="Consolas"/>
+          <w:sz w:val="19"/>
+        </w:rPr>
+        <w:t xml:space="preserve">            {</w:t>
+      </w:r>
+    </w:p>
+    <w:p>
+      <w:pPr>
+        <w:pStyle w:val="NoSpacing"/>
+        <w:rPr>
+          <w:rFonts w:ascii="Consolas" w:hAnsi="Consolas"/>
+          <w:sz w:val="19"/>
+        </w:rPr>
+      </w:pPr>
+      <w:r>
+        <w:rPr>
+          <w:rFonts w:ascii="Consolas" w:hAnsi="Consolas"/>
+          <w:sz w:val="19"/>
+        </w:rPr>
+        <w:t xml:space="preserve">                Console.WriteLine("[VERIFICATION] Reading 'error_summary.txt' directly from the local filesystem");</w:t>
+      </w:r>
+    </w:p>
+    <w:p>
+      <w:pPr>
+        <w:pStyle w:val="NoSpacing"/>
+        <w:rPr>
+          <w:rFonts w:ascii="Consolas" w:hAnsi="Consolas"/>
+          <w:sz w:val="19"/>
+        </w:rPr>
+      </w:pPr>
+      <w:r>
+        <w:rPr>
+          <w:rFonts w:ascii="Consolas" w:hAnsi="Consolas"/>
+          <w:sz w:val="19"/>
+        </w:rPr>
+        <w:t xml:space="preserve">                Console.WriteLine(await File.ReadAllTextAsync(summaryPath));</w:t>
+      </w:r>
+    </w:p>
+    <w:p>
+      <w:pPr>
+        <w:pStyle w:val="NoSpacing"/>
+        <w:rPr>
+          <w:rFonts w:ascii="Consolas" w:hAnsi="Consolas"/>
+          <w:sz w:val="19"/>
+        </w:rPr>
+      </w:pPr>
+      <w:r>
+        <w:rPr>
+          <w:rFonts w:ascii="Consolas" w:hAnsi="Consolas"/>
+          <w:sz w:val="19"/>
+        </w:rPr>
+        <w:t xml:space="preserve">            }</w:t>
+      </w:r>
+    </w:p>
+    <w:p>
+      <w:pPr>
+        <w:pStyle w:val="NoSpacing"/>
+        <w:rPr>
+          <w:rFonts w:ascii="Consolas" w:hAnsi="Consolas"/>
+          <w:sz w:val="19"/>
+        </w:rPr>
+      </w:pPr>
+    </w:p>
+    <w:p>
+      <w:pPr>
+        <w:pStyle w:val="NoSpacing"/>
+        <w:rPr>
+          <w:rFonts w:ascii="Consolas" w:hAnsi="Consolas"/>
+          <w:sz w:val="19"/>
+        </w:rPr>
+      </w:pPr>
+      <w:r>
+        <w:rPr>
+          <w:rFonts w:ascii="Consolas" w:hAnsi="Consolas"/>
+          <w:sz w:val="19"/>
+        </w:rPr>
+        <w:t xml:space="preserve">        }</w:t>
+      </w:r>
+    </w:p>
+    <w:p>
+      <w:pPr>
+        <w:pStyle w:val="NoSpacing"/>
+        <w:rPr>
+          <w:rFonts w:ascii="Consolas" w:hAnsi="Consolas"/>
+          <w:sz w:val="19"/>
+        </w:rPr>
+      </w:pPr>
+    </w:p>
+    <w:p>
+      <w:pPr>
+        <w:pStyle w:val="NoSpacing"/>
+        <w:rPr>
+          <w:rFonts w:ascii="Consolas" w:hAnsi="Consolas"/>
+          <w:sz w:val="19"/>
+        </w:rPr>
+      </w:pPr>
+      <w:r>
+        <w:rPr>
+          <w:rFonts w:ascii="Consolas" w:hAnsi="Consolas"/>
+          <w:sz w:val="19"/>
+        </w:rPr>
+        <w:t xml:space="preserve">        // Helper method to generate a log file for our demonstration</w:t>
+      </w:r>
+    </w:p>
+    <w:p>
+      <w:pPr>
+        <w:pStyle w:val="NoSpacing"/>
+        <w:rPr>
+          <w:rFonts w:ascii="Consolas" w:hAnsi="Consolas"/>
+          <w:sz w:val="19"/>
+        </w:rPr>
+      </w:pPr>
+      <w:r>
+        <w:rPr>
+          <w:rFonts w:ascii="Consolas" w:hAnsi="Consolas"/>
+          <w:sz w:val="19"/>
+        </w:rPr>
+        <w:t xml:space="preserve">        static void SetupDummyLogFile()</w:t>
+      </w:r>
+    </w:p>
+    <w:p>
+      <w:pPr>
+        <w:pStyle w:val="NoSpacing"/>
+        <w:rPr>
+          <w:rFonts w:ascii="Consolas" w:hAnsi="Consolas"/>
+          <w:sz w:val="19"/>
+        </w:rPr>
+      </w:pPr>
+      <w:r>
+        <w:rPr>
+          <w:rFonts w:ascii="Consolas" w:hAnsi="Consolas"/>
+          <w:sz w:val="19"/>
+        </w:rPr>
+        <w:t xml:space="preserve">        {</w:t>
+      </w:r>
+    </w:p>
+    <w:p>
+      <w:pPr>
+        <w:pStyle w:val="NoSpacing"/>
+        <w:rPr>
+          <w:rFonts w:ascii="Consolas" w:hAnsi="Consolas"/>
+          <w:sz w:val="19"/>
+        </w:rPr>
+      </w:pPr>
+      <w:r>
+        <w:rPr>
+          <w:rFonts w:ascii="Consolas" w:hAnsi="Consolas"/>
+          <w:sz w:val="19"/>
+        </w:rPr>
+        <w:t xml:space="preserve">            string path = Path.Combine(Directory.GetCurrentDirectory(), "server_logs.txt");</w:t>
+      </w:r>
+    </w:p>
+    <w:p>
+      <w:pPr>
+        <w:pStyle w:val="NoSpacing"/>
+        <w:rPr>
+          <w:rFonts w:ascii="Consolas" w:hAnsi="Consolas"/>
+          <w:sz w:val="19"/>
+        </w:rPr>
+      </w:pPr>
+      <w:r>
+        <w:rPr>
+          <w:rFonts w:ascii="Consolas" w:hAnsi="Consolas"/>
+          <w:sz w:val="19"/>
+        </w:rPr>
+        <w:t xml:space="preserve">            string logContent = @"</w:t>
+      </w:r>
+    </w:p>
+    <w:p>
+      <w:pPr>
+        <w:pStyle w:val="NoSpacing"/>
+        <w:rPr>
+          <w:rFonts w:ascii="Consolas" w:hAnsi="Consolas"/>
+          <w:sz w:val="19"/>
+        </w:rPr>
+      </w:pPr>
+      <w:r>
+        <w:rPr>
+          <w:rFonts w:ascii="Consolas" w:hAnsi="Consolas"/>
+          <w:sz w:val="19"/>
+        </w:rPr>
+        <w:t>[08:00:00] INFO - Server booted successfully.</w:t>
+      </w:r>
+    </w:p>
+    <w:p>
+      <w:pPr>
+        <w:pStyle w:val="NoSpacing"/>
+        <w:rPr>
+          <w:rFonts w:ascii="Consolas" w:hAnsi="Consolas"/>
+          <w:sz w:val="19"/>
+        </w:rPr>
+      </w:pPr>
+      <w:r>
+        <w:rPr>
+          <w:rFonts w:ascii="Consolas" w:hAnsi="Consolas"/>
+          <w:sz w:val="19"/>
+        </w:rPr>
+        <w:t>[08:15:22] INFO - User admin logged in.</w:t>
+      </w:r>
+    </w:p>
+    <w:p>
+      <w:pPr>
+        <w:pStyle w:val="NoSpacing"/>
+        <w:rPr>
+          <w:rFonts w:ascii="Consolas" w:hAnsi="Consolas"/>
+          <w:sz w:val="19"/>
+        </w:rPr>
+      </w:pPr>
+      <w:r>
+        <w:rPr>
+          <w:rFonts w:ascii="Consolas" w:hAnsi="Consolas"/>
+          <w:sz w:val="19"/>
+        </w:rPr>
+        <w:t>[08:45:01] ERROR - DatabaseConnectionException: Failed to connect to DB at 192.168.1.50. Timeout.</w:t>
+      </w:r>
+    </w:p>
+    <w:p>
+      <w:pPr>
+        <w:pStyle w:val="NoSpacing"/>
+        <w:rPr>
+          <w:rFonts w:ascii="Consolas" w:hAnsi="Consolas"/>
+          <w:sz w:val="19"/>
+        </w:rPr>
+      </w:pPr>
+      <w:r>
+        <w:rPr>
+          <w:rFonts w:ascii="Consolas" w:hAnsi="Consolas"/>
+          <w:sz w:val="19"/>
+        </w:rPr>
+        <w:t>[09:10:00] INFO - Nightly backup started.</w:t>
+      </w:r>
+    </w:p>
+    <w:p>
+      <w:pPr>
+        <w:pStyle w:val="NoSpacing"/>
+        <w:rPr>
+          <w:rFonts w:ascii="Consolas" w:hAnsi="Consolas"/>
+          <w:sz w:val="19"/>
+        </w:rPr>
+      </w:pPr>
       <w:r>
         <w:rPr>
           <w:rFonts w:ascii="Consolas" w:hAnsi="Consolas"/>
           <w:sz w:val="19"/>
         </w:rPr>
         <w:lastRenderedPageBreak/>
-        <w:t>eName}' was successfully created and written";</w:t>
+        <w:t>[09:12:44] ERROR - NullReferenceException in PaymentProcessingModule.cs line 42.</w:t>
+      </w:r>
+    </w:p>
+    <w:p>
+      <w:pPr>
+        <w:pStyle w:val="NoSpacing"/>
+        <w:rPr>
+          <w:rFonts w:ascii="Consolas" w:hAnsi="Consolas"/>
+          <w:sz w:val="19"/>
+        </w:rPr>
+      </w:pPr>
+      <w:r>
+        <w:rPr>
+          <w:rFonts w:ascii="Consolas" w:hAnsi="Consolas"/>
+          <w:sz w:val="19"/>
+        </w:rPr>
+        <w:t>[10:00:00] INFO - Routine health check passed.</w:t>
+      </w:r>
+    </w:p>
+    <w:p>
+      <w:pPr>
+        <w:pStyle w:val="NoSpacing"/>
+        <w:rPr>
+          <w:rFonts w:ascii="Consolas" w:hAnsi="Consolas"/>
+          <w:sz w:val="19"/>
+        </w:rPr>
+      </w:pPr>
+      <w:r>
+        <w:rPr>
+          <w:rFonts w:ascii="Consolas" w:hAnsi="Consolas"/>
+          <w:sz w:val="19"/>
+        </w:rPr>
+        <w:t>";</w:t>
+      </w:r>
+    </w:p>
+    <w:p>
+      <w:pPr>
+        <w:pStyle w:val="NoSpacing"/>
+        <w:rPr>
+          <w:rFonts w:ascii="Consolas" w:hAnsi="Consolas"/>
+          <w:sz w:val="19"/>
+        </w:rPr>
+      </w:pPr>
+      <w:r>
+        <w:rPr>
+          <w:rFonts w:ascii="Consolas" w:hAnsi="Consolas"/>
+          <w:sz w:val="19"/>
+        </w:rPr>
+        <w:t xml:space="preserve">            File.WriteAllText(path, logContent.Trim());</w:t>
       </w:r>
     </w:p>
     <w:p>
@@ -1325,1012 +2929,6 @@
           <w:sz w:val="19"/>
         </w:rPr>
       </w:pPr>
-    </w:p>
-    <w:p>
-      <w:pPr>
-        <w:pStyle w:val="NoSpacing"/>
-        <w:rPr>
-          <w:rFonts w:ascii="Consolas" w:hAnsi="Consolas"/>
-          <w:sz w:val="19"/>
-        </w:rPr>
-      </w:pPr>
-      <w:r>
-        <w:rPr>
-          <w:rFonts w:ascii="Consolas" w:hAnsi="Consolas"/>
-          <w:sz w:val="19"/>
-        </w:rPr>
-        <w:t xml:space="preserve">    class Program</w:t>
-      </w:r>
-    </w:p>
-    <w:p>
-      <w:pPr>
-        <w:pStyle w:val="NoSpacing"/>
-        <w:rPr>
-          <w:rFonts w:ascii="Consolas" w:hAnsi="Consolas"/>
-          <w:sz w:val="19"/>
-        </w:rPr>
-      </w:pPr>
-      <w:r>
-        <w:rPr>
-          <w:rFonts w:ascii="Consolas" w:hAnsi="Consolas"/>
-          <w:sz w:val="19"/>
-        </w:rPr>
-        <w:t xml:space="preserve">    {</w:t>
-      </w:r>
-    </w:p>
-    <w:p>
-      <w:pPr>
-        <w:pStyle w:val="NoSpacing"/>
-        <w:rPr>
-          <w:rFonts w:ascii="Consolas" w:hAnsi="Consolas"/>
-          <w:sz w:val="19"/>
-        </w:rPr>
-      </w:pPr>
-      <w:r>
-        <w:rPr>
-          <w:rFonts w:ascii="Consolas" w:hAnsi="Consolas"/>
-          <w:sz w:val="19"/>
-        </w:rPr>
-        <w:t xml:space="preserve">        static async Task Main(string[] args)</w:t>
-      </w:r>
-    </w:p>
-    <w:p>
-      <w:pPr>
-        <w:pStyle w:val="NoSpacing"/>
-        <w:rPr>
-          <w:rFonts w:ascii="Consolas" w:hAnsi="Consolas"/>
-          <w:sz w:val="19"/>
-        </w:rPr>
-      </w:pPr>
-      <w:r>
-        <w:rPr>
-          <w:rFonts w:ascii="Consolas" w:hAnsi="Consolas"/>
-          <w:sz w:val="19"/>
-        </w:rPr>
-        <w:t xml:space="preserve">        {</w:t>
-      </w:r>
-    </w:p>
-    <w:p>
-      <w:pPr>
-        <w:pStyle w:val="NoSpacing"/>
-        <w:rPr>
-          <w:rFonts w:ascii="Consolas" w:hAnsi="Consolas"/>
-          <w:sz w:val="19"/>
-        </w:rPr>
-      </w:pPr>
-      <w:r>
-        <w:rPr>
-          <w:rFonts w:ascii="Consolas" w:hAnsi="Consolas"/>
-          <w:sz w:val="19"/>
-        </w:rPr>
-        <w:t xml:space="preserve">            // Step 2: Setup the Dummy Log File for the AI to find</w:t>
-      </w:r>
-    </w:p>
-    <w:p>
-      <w:pPr>
-        <w:pStyle w:val="NoSpacing"/>
-        <w:rPr>
-          <w:rFonts w:ascii="Consolas" w:hAnsi="Consolas"/>
-          <w:sz w:val="19"/>
-        </w:rPr>
-      </w:pPr>
-      <w:r>
-        <w:rPr>
-          <w:rFonts w:ascii="Consolas" w:hAnsi="Consolas"/>
-          <w:sz w:val="19"/>
-        </w:rPr>
-        <w:t xml:space="preserve">            SetupDummyLogFile();</w:t>
-      </w:r>
-    </w:p>
-    <w:p>
-      <w:pPr>
-        <w:pStyle w:val="NoSpacing"/>
-        <w:rPr>
-          <w:rFonts w:ascii="Consolas" w:hAnsi="Consolas"/>
-          <w:sz w:val="19"/>
-        </w:rPr>
-      </w:pPr>
-    </w:p>
-    <w:p>
-      <w:pPr>
-        <w:pStyle w:val="NoSpacing"/>
-        <w:rPr>
-          <w:rFonts w:ascii="Consolas" w:hAnsi="Consolas"/>
-          <w:sz w:val="19"/>
-        </w:rPr>
-      </w:pPr>
-      <w:r>
-        <w:rPr>
-          <w:rFonts w:ascii="Consolas" w:hAnsi="Consolas"/>
-          <w:sz w:val="19"/>
-        </w:rPr>
-        <w:t xml:space="preserve">            // Step 3: Initialize the Kernel with our model</w:t>
-      </w:r>
-    </w:p>
-    <w:p>
-      <w:pPr>
-        <w:pStyle w:val="NoSpacing"/>
-        <w:rPr>
-          <w:rFonts w:ascii="Consolas" w:hAnsi="Consolas"/>
-          <w:sz w:val="19"/>
-        </w:rPr>
-      </w:pPr>
-      <w:r>
-        <w:rPr>
-          <w:rFonts w:ascii="Consolas" w:hAnsi="Consolas"/>
-          <w:sz w:val="19"/>
-        </w:rPr>
-        <w:t xml:space="preserve">            string apiKey = Environment.GetEnvironmentVariable("GEMINI_API_KEY")</w:t>
-      </w:r>
-    </w:p>
-    <w:p>
-      <w:pPr>
-        <w:pStyle w:val="NoSpacing"/>
-        <w:rPr>
-          <w:rFonts w:ascii="Consolas" w:hAnsi="Consolas"/>
-          <w:sz w:val="19"/>
-        </w:rPr>
-      </w:pPr>
-      <w:r>
-        <w:rPr>
-          <w:rFonts w:ascii="Consolas" w:hAnsi="Consolas"/>
-          <w:sz w:val="19"/>
-        </w:rPr>
-        <w:t xml:space="preserve">                ?? throw new Exception("GEMINI_API_KEY environment variable not set.");</w:t>
-      </w:r>
-    </w:p>
-    <w:p>
-      <w:pPr>
-        <w:pStyle w:val="NoSpacing"/>
-        <w:rPr>
-          <w:rFonts w:ascii="Consolas" w:hAnsi="Consolas"/>
-          <w:sz w:val="19"/>
-        </w:rPr>
-      </w:pPr>
-      <w:r>
-        <w:rPr>
-          <w:rFonts w:ascii="Consolas" w:hAnsi="Consolas"/>
-          <w:sz w:val="19"/>
-        </w:rPr>
-        <w:t xml:space="preserve">            string model = "gemini-2.5-flash";</w:t>
-      </w:r>
-    </w:p>
-    <w:p>
-      <w:pPr>
-        <w:pStyle w:val="NoSpacing"/>
-        <w:rPr>
-          <w:rFonts w:ascii="Consolas" w:hAnsi="Consolas"/>
-          <w:sz w:val="19"/>
-        </w:rPr>
-      </w:pPr>
-    </w:p>
-    <w:p>
-      <w:pPr>
-        <w:pStyle w:val="NoSpacing"/>
-        <w:rPr>
-          <w:rFonts w:ascii="Consolas" w:hAnsi="Consolas"/>
-          <w:sz w:val="19"/>
-        </w:rPr>
-      </w:pPr>
-      <w:r>
-        <w:rPr>
-          <w:rFonts w:ascii="Consolas" w:hAnsi="Consolas"/>
-          <w:sz w:val="19"/>
-        </w:rPr>
-        <w:t xml:space="preserve">            var builder = Kernel.CreateBuilder();</w:t>
-      </w:r>
-    </w:p>
-    <w:p>
-      <w:pPr>
-        <w:pStyle w:val="NoSpacing"/>
-        <w:rPr>
-          <w:rFonts w:ascii="Consolas" w:hAnsi="Consolas"/>
-          <w:sz w:val="19"/>
-        </w:rPr>
-      </w:pPr>
-      <w:r>
-        <w:rPr>
-          <w:rFonts w:ascii="Consolas" w:hAnsi="Consolas"/>
-          <w:sz w:val="19"/>
-        </w:rPr>
-        <w:t xml:space="preserve">            builder.AddGoogleAIGeminiChatCompletion(model, apiKey);</w:t>
-      </w:r>
-    </w:p>
-    <w:p>
-      <w:pPr>
-        <w:pStyle w:val="NoSpacing"/>
-        <w:rPr>
-          <w:rFonts w:ascii="Consolas" w:hAnsi="Consolas"/>
-          <w:sz w:val="19"/>
-        </w:rPr>
-      </w:pPr>
-    </w:p>
-    <w:p>
-      <w:pPr>
-        <w:pStyle w:val="NoSpacing"/>
-        <w:rPr>
-          <w:rFonts w:ascii="Consolas" w:hAnsi="Consolas"/>
-          <w:sz w:val="19"/>
-        </w:rPr>
-      </w:pPr>
-      <w:r>
-        <w:rPr>
-          <w:rFonts w:ascii="Consolas" w:hAnsi="Consolas"/>
-          <w:sz w:val="19"/>
-        </w:rPr>
-        <w:t xml:space="preserve">            // Step 4: Add our file system plugin</w:t>
-      </w:r>
-    </w:p>
-    <w:p>
-      <w:pPr>
-        <w:pStyle w:val="NoSpacing"/>
-        <w:rPr>
-          <w:rFonts w:ascii="Consolas" w:hAnsi="Consolas"/>
-          <w:sz w:val="19"/>
-        </w:rPr>
-      </w:pPr>
-      <w:r>
-        <w:rPr>
-          <w:rFonts w:ascii="Consolas" w:hAnsi="Consolas"/>
-          <w:sz w:val="19"/>
-        </w:rPr>
-        <w:t xml:space="preserve">            builder.Plugins.AddFromObject(new FileSystemPlugin(), "FileSystem");</w:t>
-      </w:r>
-    </w:p>
-    <w:p>
-      <w:pPr>
-        <w:pStyle w:val="NoSpacing"/>
-        <w:rPr>
-          <w:rFonts w:ascii="Consolas" w:hAnsi="Consolas"/>
-          <w:sz w:val="19"/>
-        </w:rPr>
-      </w:pPr>
-    </w:p>
-    <w:p>
-      <w:pPr>
-        <w:pStyle w:val="NoSpacing"/>
-        <w:rPr>
-          <w:rFonts w:ascii="Consolas" w:hAnsi="Consolas"/>
-          <w:sz w:val="19"/>
-        </w:rPr>
-      </w:pPr>
-      <w:r>
-        <w:rPr>
-          <w:rFonts w:ascii="Consolas" w:hAnsi="Consolas"/>
-          <w:sz w:val="19"/>
-        </w:rPr>
-        <w:t xml:space="preserve">            Kernel kernel = builder.Build();</w:t>
-      </w:r>
-    </w:p>
-    <w:p>
-      <w:pPr>
-        <w:pStyle w:val="NoSpacing"/>
-        <w:rPr>
-          <w:rFonts w:ascii="Consolas" w:hAnsi="Consolas"/>
-          <w:sz w:val="19"/>
-        </w:rPr>
-      </w:pPr>
-    </w:p>
-    <w:p>
-      <w:pPr>
-        <w:pStyle w:val="NoSpacing"/>
-        <w:rPr>
-          <w:rFonts w:ascii="Consolas" w:hAnsi="Consolas"/>
-          <w:sz w:val="19"/>
-        </w:rPr>
-      </w:pPr>
-      <w:r>
-        <w:rPr>
-          <w:rFonts w:ascii="Consolas" w:hAnsi="Consolas"/>
-          <w:sz w:val="19"/>
-        </w:rPr>
-        <w:t xml:space="preserve">            // Step 5: Define a multi-step task for the AI</w:t>
-      </w:r>
-    </w:p>
-    <w:p>
-      <w:pPr>
-        <w:pStyle w:val="NoSpacing"/>
-        <w:rPr>
-          <w:rFonts w:ascii="Consolas" w:hAnsi="Consolas"/>
-          <w:sz w:val="19"/>
-        </w:rPr>
-      </w:pPr>
-      <w:r>
-        <w:rPr>
-          <w:rFonts w:ascii="Consolas" w:hAnsi="Consolas"/>
-          <w:sz w:val="19"/>
-        </w:rPr>
-        <w:t xml:space="preserve">            string prompt = "Look in the current directory for a server log file.  Read its contents, figure out what errors occurred, and write a summary of those errors into a new file called 'error_summary.txt'.";</w:t>
-      </w:r>
-    </w:p>
-    <w:p>
-      <w:pPr>
-        <w:pStyle w:val="NoSpacing"/>
-        <w:rPr>
-          <w:rFonts w:ascii="Consolas" w:hAnsi="Consolas"/>
-          <w:sz w:val="19"/>
-        </w:rPr>
-      </w:pPr>
-    </w:p>
-    <w:p>
-      <w:pPr>
-        <w:pStyle w:val="NoSpacing"/>
-        <w:rPr>
-          <w:rFonts w:ascii="Consolas" w:hAnsi="Consolas"/>
-          <w:sz w:val="19"/>
-        </w:rPr>
-      </w:pPr>
-      <w:r>
-        <w:rPr>
-          <w:rFonts w:ascii="Consolas" w:hAnsi="Consolas"/>
-          <w:sz w:val="19"/>
-        </w:rPr>
-        <w:t xml:space="preserve">            // Step 6: Enable Auto-Invocation so the AI can chain the tools</w:t>
-      </w:r>
-    </w:p>
-    <w:p>
-      <w:pPr>
-        <w:pStyle w:val="NoSpacing"/>
-        <w:rPr>
-          <w:rFonts w:ascii="Consolas" w:hAnsi="Consolas"/>
-          <w:sz w:val="19"/>
-        </w:rPr>
-      </w:pPr>
-      <w:r>
-        <w:rPr>
-          <w:rFonts w:ascii="Consolas" w:hAnsi="Consolas"/>
-          <w:sz w:val="19"/>
-        </w:rPr>
-        <w:t xml:space="preserve">            var executionSettings = new GeminiPromptExecutionSettings</w:t>
-      </w:r>
-    </w:p>
-    <w:p>
-      <w:pPr>
-        <w:pStyle w:val="NoSpacing"/>
-        <w:rPr>
-          <w:rFonts w:ascii="Consolas" w:hAnsi="Consolas"/>
-          <w:sz w:val="19"/>
-        </w:rPr>
-      </w:pPr>
-      <w:r>
-        <w:rPr>
-          <w:rFonts w:ascii="Consolas" w:hAnsi="Consolas"/>
-          <w:sz w:val="19"/>
-        </w:rPr>
-        <w:t xml:space="preserve">            {</w:t>
-      </w:r>
-    </w:p>
-    <w:p>
-      <w:pPr>
-        <w:pStyle w:val="NoSpacing"/>
-        <w:rPr>
-          <w:rFonts w:ascii="Consolas" w:hAnsi="Consolas"/>
-          <w:sz w:val="19"/>
-        </w:rPr>
-      </w:pPr>
-      <w:r>
-        <w:rPr>
-          <w:rFonts w:ascii="Consolas" w:hAnsi="Consolas"/>
-          <w:sz w:val="19"/>
-        </w:rPr>
-        <w:t xml:space="preserve">                ToolCallBehavior = GeminiToolCallBehavior.AutoInvokeKernelFunctions,</w:t>
-      </w:r>
-    </w:p>
-    <w:p>
-      <w:pPr>
-        <w:pStyle w:val="NoSpacing"/>
-        <w:rPr>
-          <w:rFonts w:ascii="Consolas" w:hAnsi="Consolas"/>
-          <w:sz w:val="19"/>
-        </w:rPr>
-      </w:pPr>
-      <w:r>
-        <w:rPr>
-          <w:rFonts w:ascii="Consolas" w:hAnsi="Consolas"/>
-          <w:sz w:val="19"/>
-        </w:rPr>
-        <w:t xml:space="preserve">                Temperature = 0.0</w:t>
-      </w:r>
-    </w:p>
-    <w:p>
-      <w:pPr>
-        <w:pStyle w:val="NoSpacing"/>
-        <w:rPr>
-          <w:rFonts w:ascii="Consolas" w:hAnsi="Consolas"/>
-          <w:sz w:val="19"/>
-        </w:rPr>
-      </w:pPr>
-      <w:r>
-        <w:rPr>
-          <w:rFonts w:ascii="Consolas" w:hAnsi="Consolas"/>
-          <w:sz w:val="19"/>
-        </w:rPr>
-        <w:t xml:space="preserve">            };</w:t>
-      </w:r>
-    </w:p>
-    <w:p>
-      <w:pPr>
-        <w:pStyle w:val="NoSpacing"/>
-        <w:rPr>
-          <w:rFonts w:ascii="Consolas" w:hAnsi="Consolas"/>
-          <w:sz w:val="19"/>
-        </w:rPr>
-      </w:pPr>
-    </w:p>
-    <w:p>
-      <w:pPr>
-        <w:pStyle w:val="NoSpacing"/>
-        <w:rPr>
-          <w:rFonts w:ascii="Consolas" w:hAnsi="Consolas"/>
-          <w:sz w:val="19"/>
-        </w:rPr>
-      </w:pPr>
-      <w:r>
-        <w:rPr>
-          <w:rFonts w:ascii="Consolas" w:hAnsi="Consolas"/>
-          <w:sz w:val="19"/>
-        </w:rPr>
-        <w:t xml:space="preserve">            var arguments = new KernelArguments(executionSettings);</w:t>
-      </w:r>
-    </w:p>
-    <w:p>
-      <w:pPr>
-        <w:pStyle w:val="NoSpacing"/>
-        <w:rPr>
-          <w:rFonts w:ascii="Consolas" w:hAnsi="Consolas"/>
-          <w:sz w:val="19"/>
-        </w:rPr>
-      </w:pPr>
-    </w:p>
-    <w:p>
-      <w:pPr>
-        <w:pStyle w:val="NoSpacing"/>
-        <w:rPr>
-          <w:rFonts w:ascii="Consolas" w:hAnsi="Consolas"/>
-          <w:sz w:val="19"/>
-        </w:rPr>
-      </w:pPr>
-      <w:r>
-        <w:rPr>
-          <w:rFonts w:ascii="Consolas" w:hAnsi="Consolas"/>
-          <w:sz w:val="19"/>
-        </w:rPr>
-        <w:t xml:space="preserve">            Console.WriteLine($"Task: {prompt}");</w:t>
-      </w:r>
-    </w:p>
-    <w:p>
-      <w:pPr>
-        <w:pStyle w:val="NoSpacing"/>
-        <w:rPr>
-          <w:rFonts w:ascii="Consolas" w:hAnsi="Consolas"/>
-          <w:sz w:val="19"/>
-        </w:rPr>
-      </w:pPr>
-      <w:r>
-        <w:rPr>
-          <w:rFonts w:ascii="Consolas" w:hAnsi="Consolas"/>
-          <w:sz w:val="19"/>
-        </w:rPr>
-        <w:t xml:space="preserve">            Console.WriteLine("Agent is thinking and interacting with the file system...");</w:t>
-      </w:r>
-    </w:p>
-    <w:p>
-      <w:pPr>
-        <w:pStyle w:val="NoSpacing"/>
-        <w:rPr>
-          <w:rFonts w:ascii="Consolas" w:hAnsi="Consolas"/>
-          <w:sz w:val="19"/>
-        </w:rPr>
-      </w:pPr>
-    </w:p>
-    <w:p>
-      <w:pPr>
-        <w:pStyle w:val="NoSpacing"/>
-        <w:rPr>
-          <w:rFonts w:ascii="Consolas" w:hAnsi="Consolas"/>
-          <w:sz w:val="19"/>
-        </w:rPr>
-      </w:pPr>
-      <w:r>
-        <w:rPr>
-          <w:rFonts w:ascii="Consolas" w:hAnsi="Consolas"/>
-          <w:sz w:val="19"/>
-        </w:rPr>
-        <w:t xml:space="preserve">            // Step 7: Execute the prompt</w:t>
-      </w:r>
-    </w:p>
-    <w:p>
-      <w:pPr>
-        <w:pStyle w:val="NoSpacing"/>
-        <w:rPr>
-          <w:rFonts w:ascii="Consolas" w:hAnsi="Consolas"/>
-          <w:sz w:val="19"/>
-        </w:rPr>
-      </w:pPr>
-      <w:r>
-        <w:rPr>
-          <w:rFonts w:ascii="Consolas" w:hAnsi="Consolas"/>
-          <w:sz w:val="19"/>
-        </w:rPr>
-        <w:t xml:space="preserve">            var result = await kernel.InvokePromptAsync(prompt, arguments);</w:t>
-      </w:r>
-    </w:p>
-    <w:p>
-      <w:pPr>
-        <w:pStyle w:val="NoSpacing"/>
-        <w:rPr>
-          <w:rFonts w:ascii="Consolas" w:hAnsi="Consolas"/>
-          <w:sz w:val="19"/>
-        </w:rPr>
-      </w:pPr>
-    </w:p>
-    <w:p>
-      <w:pPr>
-        <w:pStyle w:val="NoSpacing"/>
-        <w:rPr>
-          <w:rFonts w:ascii="Consolas" w:hAnsi="Consolas"/>
-          <w:sz w:val="19"/>
-        </w:rPr>
-      </w:pPr>
-      <w:r>
-        <w:rPr>
-          <w:rFonts w:ascii="Consolas" w:hAnsi="Consolas"/>
-          <w:sz w:val="19"/>
-        </w:rPr>
-        <w:t xml:space="preserve">            // Step 8: Display the final result</w:t>
-      </w:r>
-    </w:p>
-    <w:p>
-      <w:pPr>
-        <w:pStyle w:val="NoSpacing"/>
-        <w:rPr>
-          <w:rFonts w:ascii="Consolas" w:hAnsi="Consolas"/>
-          <w:sz w:val="19"/>
-        </w:rPr>
-      </w:pPr>
-      <w:r>
-        <w:rPr>
-          <w:rFonts w:ascii="Consolas" w:hAnsi="Consolas"/>
-          <w:sz w:val="19"/>
-        </w:rPr>
-        <w:t xml:space="preserve">            Console.WriteLine("--- AI TASK REPORT ---");</w:t>
-      </w:r>
-    </w:p>
-    <w:p>
-      <w:pPr>
-        <w:pStyle w:val="NoSpacing"/>
-        <w:rPr>
-          <w:rFonts w:ascii="Consolas" w:hAnsi="Consolas"/>
-          <w:sz w:val="19"/>
-        </w:rPr>
-      </w:pPr>
-      <w:r>
-        <w:rPr>
-          <w:rFonts w:ascii="Consolas" w:hAnsi="Consolas"/>
-          <w:sz w:val="19"/>
-        </w:rPr>
-        <w:t xml:space="preserve">            Console.WriteLine(result.ToString().Trim());</w:t>
-      </w:r>
-    </w:p>
-    <w:p>
-      <w:pPr>
-        <w:pStyle w:val="NoSpacing"/>
-        <w:rPr>
-          <w:rFonts w:ascii="Consolas" w:hAnsi="Consolas"/>
-          <w:sz w:val="19"/>
-        </w:rPr>
-      </w:pPr>
-      <w:r>
-        <w:rPr>
-          <w:rFonts w:ascii="Consolas" w:hAnsi="Consolas"/>
-          <w:sz w:val="19"/>
-        </w:rPr>
-        <w:t xml:space="preserve">            Console.WriteLine("----------------------");</w:t>
-      </w:r>
-    </w:p>
-    <w:p>
-      <w:pPr>
-        <w:pStyle w:val="NoSpacing"/>
-        <w:rPr>
-          <w:rFonts w:ascii="Consolas" w:hAnsi="Consolas"/>
-          <w:sz w:val="19"/>
-        </w:rPr>
-      </w:pPr>
-    </w:p>
-    <w:p>
-      <w:pPr>
-        <w:pStyle w:val="NoSpacing"/>
-        <w:rPr>
-          <w:rFonts w:ascii="Consolas" w:hAnsi="Consolas"/>
-          <w:sz w:val="19"/>
-        </w:rPr>
-      </w:pPr>
-      <w:r>
-        <w:rPr>
-          <w:rFonts w:ascii="Consolas" w:hAnsi="Consolas"/>
-          <w:sz w:val="19"/>
-        </w:rPr>
-        <w:t xml:space="preserve">            // Verify the file was actually created on the hard drive</w:t>
-      </w:r>
-    </w:p>
-    <w:p>
-      <w:pPr>
-        <w:pStyle w:val="NoSpacing"/>
-        <w:rPr>
-          <w:rFonts w:ascii="Consolas" w:hAnsi="Consolas"/>
-          <w:sz w:val="19"/>
-        </w:rPr>
-      </w:pPr>
-      <w:r>
-        <w:rPr>
-          <w:rFonts w:ascii="Consolas" w:hAnsi="Consolas"/>
-          <w:sz w:val="19"/>
-        </w:rPr>
-        <w:t xml:space="preserve">            string summaryPath = Path.Combine(Directory.GetCurrentDirectory(), "error_summary.txt");</w:t>
-      </w:r>
-    </w:p>
-    <w:p>
-      <w:pPr>
-        <w:pStyle w:val="NoSpacing"/>
-        <w:rPr>
-          <w:rFonts w:ascii="Consolas" w:hAnsi="Consolas"/>
-          <w:sz w:val="19"/>
-        </w:rPr>
-      </w:pPr>
-      <w:r>
-        <w:rPr>
-          <w:rFonts w:ascii="Consolas" w:hAnsi="Consolas"/>
-          <w:sz w:val="19"/>
-        </w:rPr>
-        <w:t xml:space="preserve">            if (File.Exists(summaryPath))</w:t>
-      </w:r>
-    </w:p>
-    <w:p>
-      <w:pPr>
-        <w:pStyle w:val="NoSpacing"/>
-        <w:rPr>
-          <w:rFonts w:ascii="Consolas" w:hAnsi="Consolas"/>
-          <w:sz w:val="19"/>
-        </w:rPr>
-      </w:pPr>
-      <w:r>
-        <w:rPr>
-          <w:rFonts w:ascii="Consolas" w:hAnsi="Consolas"/>
-          <w:sz w:val="19"/>
-        </w:rPr>
-        <w:t xml:space="preserve">            {</w:t>
-      </w:r>
-    </w:p>
-    <w:p>
-      <w:pPr>
-        <w:pStyle w:val="NoSpacing"/>
-        <w:rPr>
-          <w:rFonts w:ascii="Consolas" w:hAnsi="Consolas"/>
-          <w:sz w:val="19"/>
-        </w:rPr>
-      </w:pPr>
-      <w:r>
-        <w:rPr>
-          <w:rFonts w:ascii="Consolas" w:hAnsi="Consolas"/>
-          <w:sz w:val="19"/>
-        </w:rPr>
-        <w:t xml:space="preserve">                Console.WriteLine("[VERIFICATION] Reading 'error_summary.txt' directly from the local filesystem");</w:t>
-      </w:r>
-    </w:p>
-    <w:p>
-      <w:pPr>
-        <w:pStyle w:val="NoSpacing"/>
-        <w:rPr>
-          <w:rFonts w:ascii="Consolas" w:hAnsi="Consolas"/>
-          <w:sz w:val="19"/>
-        </w:rPr>
-      </w:pPr>
-      <w:r>
-        <w:rPr>
-          <w:rFonts w:ascii="Consolas" w:hAnsi="Consolas"/>
-          <w:sz w:val="19"/>
-        </w:rPr>
-        <w:t xml:space="preserve">                Console.WriteLine(await File.ReadAllTextAsync(summaryPath));</w:t>
-      </w:r>
-    </w:p>
-    <w:p>
-      <w:pPr>
-        <w:pStyle w:val="NoSpacing"/>
-        <w:rPr>
-          <w:rFonts w:ascii="Consolas" w:hAnsi="Consolas"/>
-          <w:sz w:val="19"/>
-        </w:rPr>
-      </w:pPr>
-      <w:r>
-        <w:rPr>
-          <w:rFonts w:ascii="Consolas" w:hAnsi="Consolas"/>
-          <w:sz w:val="19"/>
-        </w:rPr>
-        <w:t xml:space="preserve">            }</w:t>
-      </w:r>
-    </w:p>
-    <w:p>
-      <w:pPr>
-        <w:pStyle w:val="NoSpacing"/>
-        <w:rPr>
-          <w:rFonts w:ascii="Consolas" w:hAnsi="Consolas"/>
-          <w:sz w:val="19"/>
-        </w:rPr>
-      </w:pPr>
-    </w:p>
-    <w:p>
-      <w:pPr>
-        <w:pStyle w:val="NoSpacing"/>
-        <w:rPr>
-          <w:rFonts w:ascii="Consolas" w:hAnsi="Consolas"/>
-          <w:sz w:val="19"/>
-        </w:rPr>
-      </w:pPr>
-      <w:r>
-        <w:rPr>
-          <w:rFonts w:ascii="Consolas" w:hAnsi="Consolas"/>
-          <w:sz w:val="19"/>
-        </w:rPr>
-        <w:t xml:space="preserve">        }</w:t>
-      </w:r>
-    </w:p>
-    <w:p>
-      <w:pPr>
-        <w:pStyle w:val="NoSpacing"/>
-        <w:rPr>
-          <w:rFonts w:ascii="Consolas" w:hAnsi="Consolas"/>
-          <w:sz w:val="19"/>
-        </w:rPr>
-      </w:pPr>
-    </w:p>
-    <w:p>
-      <w:pPr>
-        <w:pStyle w:val="NoSpacing"/>
-        <w:rPr>
-          <w:rFonts w:ascii="Consolas" w:hAnsi="Consolas"/>
-          <w:sz w:val="19"/>
-        </w:rPr>
-      </w:pPr>
-      <w:r>
-        <w:rPr>
-          <w:rFonts w:ascii="Consolas" w:hAnsi="Consolas"/>
-          <w:sz w:val="19"/>
-        </w:rPr>
-        <w:t xml:space="preserve">        // Helper method to generate a log file for our demonstration</w:t>
-      </w:r>
-    </w:p>
-    <w:p>
-      <w:pPr>
-        <w:pStyle w:val="NoSpacing"/>
-        <w:rPr>
-          <w:rFonts w:ascii="Consolas" w:hAnsi="Consolas"/>
-          <w:sz w:val="19"/>
-        </w:rPr>
-      </w:pPr>
-      <w:r>
-        <w:rPr>
-          <w:rFonts w:ascii="Consolas" w:hAnsi="Consolas"/>
-          <w:sz w:val="19"/>
-        </w:rPr>
-        <w:t xml:space="preserve">        static void SetupDummyLogFile()</w:t>
-      </w:r>
-    </w:p>
-    <w:p>
-      <w:pPr>
-        <w:pStyle w:val="NoSpacing"/>
-        <w:rPr>
-          <w:rFonts w:ascii="Consolas" w:hAnsi="Consolas"/>
-          <w:sz w:val="19"/>
-        </w:rPr>
-      </w:pPr>
-      <w:r>
-        <w:rPr>
-          <w:rFonts w:ascii="Consolas" w:hAnsi="Consolas"/>
-          <w:sz w:val="19"/>
-        </w:rPr>
-        <w:t xml:space="preserve">        {</w:t>
-      </w:r>
-    </w:p>
-    <w:p>
-      <w:pPr>
-        <w:pStyle w:val="NoSpacing"/>
-        <w:rPr>
-          <w:rFonts w:ascii="Consolas" w:hAnsi="Consolas"/>
-          <w:sz w:val="19"/>
-        </w:rPr>
-      </w:pPr>
-      <w:r>
-        <w:rPr>
-          <w:rFonts w:ascii="Consolas" w:hAnsi="Consolas"/>
-          <w:sz w:val="19"/>
-        </w:rPr>
-        <w:t xml:space="preserve">            string path = Path.Combine(Directory.GetCurrentDirectory(), "server_logs.txt");</w:t>
-      </w:r>
-    </w:p>
-    <w:p>
-      <w:pPr>
-        <w:pStyle w:val="NoSpacing"/>
-        <w:rPr>
-          <w:rFonts w:ascii="Consolas" w:hAnsi="Consolas"/>
-          <w:sz w:val="19"/>
-        </w:rPr>
-      </w:pPr>
-      <w:r>
-        <w:rPr>
-          <w:rFonts w:ascii="Consolas" w:hAnsi="Consolas"/>
-          <w:sz w:val="19"/>
-        </w:rPr>
-        <w:t xml:space="preserve">            string logContent = @"</w:t>
-      </w:r>
-    </w:p>
-    <w:p>
-      <w:pPr>
-        <w:pStyle w:val="NoSpacing"/>
-        <w:rPr>
-          <w:rFonts w:ascii="Consolas" w:hAnsi="Consolas"/>
-          <w:sz w:val="19"/>
-        </w:rPr>
-      </w:pPr>
-      <w:r>
-        <w:rPr>
-          <w:rFonts w:ascii="Consolas" w:hAnsi="Consolas"/>
-          <w:sz w:val="19"/>
-        </w:rPr>
-        <w:t>[08:00:00] INFO - Server booted successfully.</w:t>
-      </w:r>
-    </w:p>
-    <w:p>
-      <w:pPr>
-        <w:pStyle w:val="NoSpacing"/>
-        <w:rPr>
-          <w:rFonts w:ascii="Consolas" w:hAnsi="Consolas"/>
-          <w:sz w:val="19"/>
-        </w:rPr>
-      </w:pPr>
-      <w:r>
-        <w:rPr>
-          <w:rFonts w:ascii="Consolas" w:hAnsi="Consolas"/>
-          <w:sz w:val="19"/>
-        </w:rPr>
-        <w:t>[08:15:22] INFO - User admin logged in.</w:t>
-      </w:r>
-    </w:p>
-    <w:p>
-      <w:pPr>
-        <w:pStyle w:val="NoSpacing"/>
-        <w:rPr>
-          <w:rFonts w:ascii="Consolas" w:hAnsi="Consolas"/>
-          <w:sz w:val="19"/>
-        </w:rPr>
-      </w:pPr>
-      <w:r>
-        <w:rPr>
-          <w:rFonts w:ascii="Consolas" w:hAnsi="Consolas"/>
-          <w:sz w:val="19"/>
-        </w:rPr>
-        <w:t>[08:45:01] ERROR - DatabaseConnectionException: Failed to connect to DB at 192.168.1.50. Timeout.</w:t>
-      </w:r>
-    </w:p>
-    <w:p>
-      <w:pPr>
-        <w:pStyle w:val="NoSpacing"/>
-        <w:rPr>
-          <w:rFonts w:ascii="Consolas" w:hAnsi="Consolas"/>
-          <w:sz w:val="19"/>
-        </w:rPr>
-      </w:pPr>
-      <w:r>
-        <w:rPr>
-          <w:rFonts w:ascii="Consolas" w:hAnsi="Consolas"/>
-          <w:sz w:val="19"/>
-        </w:rPr>
-        <w:t>[09:10:00] INFO - Nightly backup started.</w:t>
-      </w:r>
-    </w:p>
-    <w:p>
-      <w:pPr>
-        <w:pStyle w:val="NoSpacing"/>
-        <w:rPr>
-          <w:rFonts w:ascii="Consolas" w:hAnsi="Consolas"/>
-          <w:sz w:val="19"/>
-        </w:rPr>
-      </w:pPr>
-      <w:r>
-        <w:rPr>
-          <w:rFonts w:ascii="Consolas" w:hAnsi="Consolas"/>
-          <w:sz w:val="19"/>
-        </w:rPr>
-        <w:t>[09:12:44] ERROR - NullReferenceException in PaymentProcessingModule.cs line 42.</w:t>
-      </w:r>
-    </w:p>
-    <w:p>
-      <w:pPr>
-        <w:pStyle w:val="NoSpacing"/>
-        <w:rPr>
-          <w:rFonts w:ascii="Consolas" w:hAnsi="Consolas"/>
-          <w:sz w:val="19"/>
-        </w:rPr>
-      </w:pPr>
-      <w:r>
-        <w:rPr>
-          <w:rFonts w:ascii="Consolas" w:hAnsi="Consolas"/>
-          <w:sz w:val="19"/>
-        </w:rPr>
-        <w:t>[10:00:00] INFO - Routine health check passed.</w:t>
-      </w:r>
-    </w:p>
-    <w:p>
-      <w:pPr>
-        <w:pStyle w:val="NoSpacing"/>
-        <w:rPr>
-          <w:rFonts w:ascii="Consolas" w:hAnsi="Consolas"/>
-          <w:sz w:val="19"/>
-        </w:rPr>
-      </w:pPr>
-      <w:r>
-        <w:rPr>
-          <w:rFonts w:ascii="Consolas" w:hAnsi="Consolas"/>
-          <w:sz w:val="19"/>
-        </w:rPr>
-        <w:t>";</w:t>
-      </w:r>
-    </w:p>
-    <w:p>
-      <w:pPr>
-        <w:pStyle w:val="NoSpacing"/>
-        <w:rPr>
-          <w:rFonts w:ascii="Consolas" w:hAnsi="Consolas"/>
-          <w:sz w:val="19"/>
-        </w:rPr>
-      </w:pPr>
-      <w:r>
-        <w:rPr>
-          <w:rFonts w:ascii="Consolas" w:hAnsi="Consolas"/>
-          <w:sz w:val="19"/>
-        </w:rPr>
-        <w:t xml:space="preserve">            File.WriteAllText(path, logContent.Trim());</w:t>
-      </w:r>
-    </w:p>
-    <w:p>
-      <w:pPr>
-        <w:pStyle w:val="NoSpacing"/>
-        <w:rPr>
-          <w:rFonts w:ascii="Consolas" w:hAnsi="Consolas"/>
-          <w:sz w:val="19"/>
-        </w:rPr>
-      </w:pPr>
-      <w:r>
-        <w:rPr>
-          <w:rFonts w:ascii="Consolas" w:hAnsi="Consolas"/>
-          <w:sz w:val="19"/>
-        </w:rPr>
-        <w:t xml:space="preserve">        }</w:t>
-      </w:r>
-    </w:p>
-    <w:p>
-      <w:pPr>
-        <w:pStyle w:val="NoSpacing"/>
-        <w:rPr>
-          <w:rFonts w:ascii="Consolas" w:hAnsi="Consolas"/>
-          <w:sz w:val="19"/>
-        </w:rPr>
-      </w:pPr>
-      <w:r>
-        <w:rPr>
-          <w:rFonts w:ascii="Consolas" w:hAnsi="Consolas"/>
-          <w:sz w:val="19"/>
-        </w:rPr>
-        <w:t xml:space="preserve">    }</w:t>
-      </w:r>
-    </w:p>
-    <w:p>
-      <w:pPr>
-        <w:pStyle w:val="NoSpacing"/>
-        <w:rPr>
-          <w:rFonts w:ascii="Consolas" w:hAnsi="Consolas"/>
-          <w:sz w:val="19"/>
-        </w:rPr>
-      </w:pPr>
       <w:r>
         <w:rPr>
           <w:rFonts w:ascii="Consolas" w:hAnsi="Consolas"/>
@@ -2356,7 +2954,13 @@
         <w:t>Step 1: The FileSystemPlugin and Sandboxing.</w:t>
       </w:r>
       <w:r>
-        <w:t xml:space="preserve"> `FileSystemPlugin` defines three `[KernelFunction]` methods — `ListFiles`, `ReadFile`, and `WriteFile` — each with the same `[Description]` treatment from Day 4 so the model knows what each does. The critical safety detail is in the constructor: `_currentDirectory = Directory.GetCurrentDirectory()` is captured once, and every subsequent file operation calls `Path.Combine(_currentDirectory, fileName)` rather than trusting a raw path from the model. This is a sandbox — when you give an AI the ability to produce side effects, you must bound what it's allowed to touch. Without this restriction, a cleverly (or maliciously) worded prompt could attempt to read or overwrite files well outside the intended demo folder.</w:t>
+        <w:t xml:space="preserve"> `FileSystemPlugin` defines three `[KernelFunction]` methods — `ListFiles`, `ReadFile`, and `WriteFile` — each with the same `[Description]` treatment from Day 4 so the model knows what each does. The critical safety detail is in the constructor: `_currentDirectory = Directory.GetCurrentDirectory()` is captured once, </w:t>
+      </w:r>
+      <w:r>
+        <w:t>and every subsequent file operation is resolved by `TryResolveSandboxedPath`, which checks the result with `Path.GetFullPath` before allowing it (plain `Path.Combine` alone would not stop `../secrets.txt` from escaping).</w:t>
+      </w:r>
+      <w:r>
+        <w:t xml:space="preserve"> This is a sandbox — when you give an AI the ability to produce side effects, you must bound what it's allowed to touch. Without this restriction, a cleverly (or maliciously) worded prompt could attempt to read or overwrite files well outside the intended demo folder.</w:t>
       </w:r>
     </w:p>
     <w:p/>

</xml_diff>